<commit_message>
Add NJ tree + cut-off; update report and slides to the cut-off conclusion
</commit_message>
<xml_diff>
--- a/report/BarcodeID_report.docx
+++ b/report/BarcodeID_report.docx
@@ -103,7 +103,7 @@
         <w:rPr>
           <w:i w:val="0"/>
         </w:rPr>
-        <w:t>DNA barcoding identifies species by comparing a short gene fragment with a reference database, but reference databases are incomplete. We asked which identification method should be trusted when a query belongs to a species that is not in the database. Using 779 cleaned COI barcodes of 45 European species of Libellulidae and Coenagrionidae from BOLD Systems, we compared a Neighbor-Joining (NJ) tree with an explicit identification rule, two machine-learning classifiers on k-mer frequencies (k-nearest neighbours and random forest, each with a calibrated 'unknown' threshold), and the classic best-close-match distance rule. With full reference coverage, all methods were equally accurate (NJ 92.4%, k-NN 93.2%, random forest 92.4%; no significant differences). When each of 39 species was removed from the reference set in turn, NJ wrongly named the unknown species for 67% of its queries on average, against 14% for k-NN, and NJ even placed two species in the wrong genus. Outside a group of 10 species that share near-identical barcodes with a relative, k-NN never named a wrong species and still reported the correct genus for 99% of unknown queries. Machine learning was also about 264 times faster per query. A best-close-match baseline showed that the safety comes mainly from having a distance cut-off; the machine-learning classifier adds fewer losses on known species. Barcode sharing between close relatives remains a limit that no barcode-only method overcomes.</w:t>
+        <w:t>DNA barcoding identifies species by comparing a short gene fragment with a reference database, but reference databases are incomplete. We asked which identification method should be trusted when a query belongs to a species that is not in the database. Using 779 cleaned COI barcodes of 45 European species of Libellulidae and Coenagrionidae from BOLD Systems, we compared a Neighbor-Joining (NJ) tree with an explicit identification rule, two machine-learning classifiers on k-mer frequencies (k-nearest neighbours and random forest, each with a calibrated 'unknown' threshold), the classic best-close-match distance rule, and the same NJ tree given a calibrated tree-distance 'unknown' cut-off. With full reference coverage, all methods were equally accurate (NJ 92.4%, k-NN 93.2%, random forest 92.4%; no significant differences). When each of 39 species was removed from the reference set in turn, the NJ tree used as usual, without a cut-off, wrongly named the missing species for 67% of its queries on average and even placed two species in the wrong genus. With a calibrated 'unknown' cut-off, the same tree wrongly named only 10% and k-NN 14%. Outside a group of 10 species that share near-identical barcodes with a relative, both never named a wrong species and still reported the correct genus. Best close match, a plain distance rule, became just as safe when calibrated the same way. The safety therefore comes from the calibrated cut-off, not from machine learning; k-NN reached it about 264 times faster per query and with slightly fewer losses on known species. Barcode sharing between close relatives remains a limit that no barcode-only method overcomes.</w:t>
       </w:r>
     </w:p>
     <w:p>
@@ -118,7 +118,7 @@
         <w:t xml:space="preserve">Main finding. </w:t>
       </w:r>
       <w:r>
-        <w:t>Machine learning matched the phylogenetic tree on known species (93% vs 92%) but wrongly named unknown species over four times less often (14% vs 67% across 39 species held out one at a time) and was about 264 times faster.</w:t>
+        <w:t>The calibrated 'unknown' cut-off, not the choice of method, is what makes identification safe. Without one, the NJ tree wrongly named 67% of species missing from the database. With one, the tree and k-NN were both safe (10% and 14% across 39 species held out one at a time; 0% outside barcode-sharing groups), and k-NN achieved this about 264 times faster.</w:t>
       </w:r>
     </w:p>
     <w:p>
@@ -183,7 +183,16 @@
         <w:spacing w:after="60"/>
       </w:pPr>
       <w:r>
-        <w:t>an explicit, reproducible identification rule for the tree, and 'unknown' thresholds for the other methods calibrated on training data only;</w:t>
+        <w:t>an explicit, reproducible identification rule for the tree, and 'unknown' cut-offs calibrated on training data only for every method, including the tree, so that all methods can be compared on equal terms;</w:t>
+      </w:r>
+    </w:p>
+    <w:p>
+      <w:pPr>
+        <w:pStyle w:val="ListBullet"/>
+        <w:spacing w:after="60"/>
+      </w:pPr>
+      <w:r>
+        <w:t>evidence from three independent methods that a calibrated cut-off, not machine learning as such, is what makes identification of missing species safe;</w:t>
       </w:r>
     </w:p>
     <w:p>
@@ -1204,7 +1213,15 @@
         <w:rPr>
           <w:i w:val="0"/>
         </w:rPr>
-        <w:t>'Ambiguous' is the tree's only way to abstain; we deliberately gave it no additional distance threshold. Building one tree per query was not feasible: Biopython's NJ takes about four minutes for 779 sequences.</w:t>
+        <w:t>Used like this, as trees usually are, 'ambiguous' is the tree's only way to abstain. Building one tree per query was not feasible: Biopython's NJ takes about four minutes for 779 sequences.</w:t>
+      </w:r>
+    </w:p>
+    <w:p>
+      <w:r>
+        <w:rPr>
+          <w:i w:val="0"/>
+        </w:rPr>
+        <w:t>To compare the tree with the classifiers on equal terms, we also evaluated the same tree with an 'unknown' cut-off ('NJ tree + cut-off'). The tree (patristic) distance from a query to its nearest training sequence is compared with a cut-off calibrated on training sequences only, inside the same tree: for every training sequence we take its tree distance to the nearest other training sequence, and the cut-off accepts 95% of these (Condition A cut-off 0.0050). A query further away is answered 'unknown', with the clade's genus. No new trees are needed. Both versions of the tree are reported throughout: plain NJ shows how trees are commonly used, and NJ + cut-off gives the fair comparison.</w:t>
       </w:r>
     </w:p>
     <w:p>
@@ -2144,7 +2161,7 @@
         <w:rPr>
           <w:i w:val="0"/>
         </w:rPr>
-        <w:t>All four classifiers and the NJ tree identified known species with about the same accuracy (91.5–93.2%; Table 2, Figure 1). No pair differs significantly (all Holm-corrected McNemar p = 1.00), and every species-bootstrap interval of a difference between NJ and a classifier includes zero. Best close match was lower (85.6%), a significant difference (Holm p ≤ 0.011). This is because it answers 'ambiguous' for 30 queries that are identical to sequences of two species, all of them in the barcode-sharing groups. Every error of the other methods also fell inside those groups, and no method named a wrong genus.</w:t>
+        <w:t>All four classifiers and the NJ tree identified known species with about the same accuracy (91.5–93.2%; Table 2, Figure 1). No pair differs significantly (all Holm-corrected McNemar p = 1.00), and every species-bootstrap interval of a difference between NJ and a classifier includes zero. Best close match was lower (85.6%), a significant difference (Holm p ≤ 0.015). This is because it answers 'ambiguous' for 30 queries that are identical to sequences of two species, all of them in the barcode-sharing groups. Every error of the other methods also fell inside those groups, and no method named a wrong genus.</w:t>
       </w:r>
     </w:p>
     <w:p>
@@ -2992,6 +3009,113 @@
           </w:p>
         </w:tc>
       </w:tr>
+      <w:tr>
+        <w:tc>
+          <w:tcPr>
+            <w:tcW w:type="dxa" w:w="2211"/>
+          </w:tcPr>
+          <w:p>
+            <w:r/>
+            <w:r>
+              <w:rPr>
+                <w:b w:val="0"/>
+                <w:sz w:val="18"/>
+              </w:rPr>
+              <w:t>NJ tree + cut-off</w:t>
+            </w:r>
+          </w:p>
+        </w:tc>
+        <w:tc>
+          <w:tcPr>
+            <w:tcW w:type="dxa" w:w="1361"/>
+          </w:tcPr>
+          <w:p>
+            <w:pPr>
+              <w:jc w:val="right"/>
+            </w:pPr>
+            <w:r/>
+            <w:r>
+              <w:rPr>
+                <w:b w:val="0"/>
+                <w:sz w:val="18"/>
+              </w:rPr>
+              <w:t>0.0%</w:t>
+            </w:r>
+          </w:p>
+        </w:tc>
+        <w:tc>
+          <w:tcPr>
+            <w:tcW w:type="dxa" w:w="1191"/>
+          </w:tcPr>
+          <w:p>
+            <w:pPr>
+              <w:jc w:val="right"/>
+            </w:pPr>
+            <w:r/>
+            <w:r>
+              <w:rPr>
+                <w:b w:val="0"/>
+                <w:sz w:val="18"/>
+              </w:rPr>
+              <w:t>0.0%</w:t>
+            </w:r>
+          </w:p>
+        </w:tc>
+        <w:tc>
+          <w:tcPr>
+            <w:tcW w:type="dxa" w:w="1191"/>
+          </w:tcPr>
+          <w:p>
+            <w:pPr>
+              <w:jc w:val="right"/>
+            </w:pPr>
+            <w:r/>
+            <w:r>
+              <w:rPr>
+                <w:b w:val="0"/>
+                <w:sz w:val="18"/>
+              </w:rPr>
+              <w:t>100.0%</w:t>
+            </w:r>
+          </w:p>
+        </w:tc>
+        <w:tc>
+          <w:tcPr>
+            <w:tcW w:type="dxa" w:w="1474"/>
+          </w:tcPr>
+          <w:p>
+            <w:pPr>
+              <w:jc w:val="right"/>
+            </w:pPr>
+            <w:r/>
+            <w:r>
+              <w:rPr>
+                <w:b w:val="0"/>
+                <w:sz w:val="18"/>
+              </w:rPr>
+              <w:t>100.0%</w:t>
+            </w:r>
+          </w:p>
+        </w:tc>
+        <w:tc>
+          <w:tcPr>
+            <w:tcW w:type="dxa" w:w="1304"/>
+          </w:tcPr>
+          <w:p>
+            <w:pPr>
+              <w:jc w:val="right"/>
+            </w:pPr>
+            <w:r/>
+            <w:r>
+              <w:rPr>
+                <w:b w:val="0"/>
+                <w:sz w:val="18"/>
+              </w:rPr>
+              <w:t>85.0%</w:t>
+            </w:r>
+          </w:p>
+        </w:tc>
+      </w:tr>
     </w:tbl>
     <w:p>
       <w:pPr>
@@ -3003,7 +3127,7 @@
         <w:rPr>
           <w:i w:val="0"/>
         </w:rPr>
-        <w:t>For species missing from the database, the methods behaved very differently (Table 3, Figure 2). The NJ tree named a wrong species for 66.9% of unknown queries. It always chose a species of the correct genus and abstained only when the nearest clade mixed several species. Without a threshold, the classifiers named a known species for every unknown query, and random forest put 22–31% of them in the wrong genus. With the calibrated threshold, k-NN flagged every unknown query, and for k = 6 it reported the correct genus for all of them. Random forest flagged 88.5–91.4%, and best close match with Meier's cut-off flagged 84.2%.</w:t>
+        <w:t>For species missing from the database, the methods behaved very differently (Table 3, Figure 2). The plain NJ tree named a wrong species for 66.9% of unknown queries. It always chose a species of the correct genus and abstained only when the nearest clade mixed several species. Without a threshold, the classifiers named a known species for every unknown query, and random forest put 22–31% of them in the wrong genus. With the calibrated threshold, k-NN flagged every unknown query, and for k = 6 it reported the correct genus for all of them. Random forest flagged 88.5–91.4%, and best close match with Meier's cut-off flagged 84.2%. Given a calibrated cut-off, the NJ tree also flagged 100.0% of unknown queries, all with the correct genus: the same tree that named a wrong species two times out of three without a cut-off became as safe as k-NN.</w:t>
       </w:r>
     </w:p>
     <w:p>
@@ -3013,7 +3137,7 @@
       <w:r>
         <w:drawing>
           <wp:inline xmlns:a="http://schemas.openxmlformats.org/drawingml/2006/main" xmlns:pic="http://schemas.openxmlformats.org/drawingml/2006/picture">
-            <wp:extent cx="5580000" cy="3906000"/>
+            <wp:extent cx="5580000" cy="4185000"/>
             <wp:docPr id="2" name="Picture 2"/>
             <wp:cNvGraphicFramePr>
               <a:graphicFrameLocks noChangeAspect="1"/>
@@ -3034,7 +3158,7 @@
                   <pic:spPr>
                     <a:xfrm>
                       <a:off x="0" y="0"/>
-                      <a:ext cx="5580000" cy="3906000"/>
+                      <a:ext cx="5580000" cy="4185000"/>
                     </a:xfrm>
                     <a:prstGeom prst="rect"/>
                   </pic:spPr>
@@ -3070,7 +3194,7 @@
         <w:rPr>
           <w:i w:val="0"/>
         </w:rPr>
-        <w:t>The NJ-versus-classifier difference is large and robust. NJ named a species 55%–67% more often than the thresholded classifiers (Holm p &lt; 0.0001; species-bootstrap lower bound +16%). Safety has a price: with the threshold on, the classifiers rejected some known species too, reaching 86.5–87.6% correct on known queries against 92.2% for NJ. Figure 3 shows the same trade-off from full to incomplete coverage.</w:t>
+        <w:t>The difference between plain NJ and the thresholded classifiers is large and robust. Plain NJ named a species 55%–67% more often (Holm p &lt; 0.0001; species-bootstrap lower bound +16%), while NJ + cut-off and k-NN did not differ at all (difference 0.0%). Safety has a price: with a cut-off on, every method rejected some known species too, reaching 85.0–87.6% correct on known queries against 92.2% for plain NJ. Figure 3 shows the same trade-off from full to incomplete coverage.</w:t>
       </w:r>
     </w:p>
     <w:p>
@@ -3910,6 +4034,113 @@
           </w:p>
         </w:tc>
       </w:tr>
+      <w:tr>
+        <w:tc>
+          <w:tcPr>
+            <w:tcW w:type="dxa" w:w="1701"/>
+          </w:tcPr>
+          <w:p>
+            <w:r/>
+            <w:r>
+              <w:rPr>
+                <w:b w:val="0"/>
+                <w:sz w:val="18"/>
+              </w:rPr>
+              <w:t>NJ tree + cut-off</w:t>
+            </w:r>
+          </w:p>
+        </w:tc>
+        <w:tc>
+          <w:tcPr>
+            <w:tcW w:type="dxa" w:w="1417"/>
+          </w:tcPr>
+          <w:p>
+            <w:pPr>
+              <w:jc w:val="right"/>
+            </w:pPr>
+            <w:r/>
+            <w:r>
+              <w:rPr>
+                <w:b w:val="0"/>
+                <w:sz w:val="18"/>
+              </w:rPr>
+              <w:t>10.3%</w:t>
+            </w:r>
+          </w:p>
+        </w:tc>
+        <w:tc>
+          <w:tcPr>
+            <w:tcW w:type="dxa" w:w="1304"/>
+          </w:tcPr>
+          <w:p>
+            <w:pPr>
+              <w:jc w:val="right"/>
+            </w:pPr>
+            <w:r/>
+            <w:r>
+              <w:rPr>
+                <w:b w:val="0"/>
+                <w:sz w:val="18"/>
+              </w:rPr>
+              <w:t>85%</w:t>
+            </w:r>
+          </w:p>
+        </w:tc>
+        <w:tc>
+          <w:tcPr>
+            <w:tcW w:type="dxa" w:w="1417"/>
+          </w:tcPr>
+          <w:p>
+            <w:pPr>
+              <w:jc w:val="right"/>
+            </w:pPr>
+            <w:r/>
+            <w:r>
+              <w:rPr>
+                <w:b w:val="0"/>
+                <w:sz w:val="18"/>
+              </w:rPr>
+              <w:t>0.0%</w:t>
+            </w:r>
+          </w:p>
+        </w:tc>
+        <w:tc>
+          <w:tcPr>
+            <w:tcW w:type="dxa" w:w="1587"/>
+          </w:tcPr>
+          <w:p>
+            <w:pPr>
+              <w:jc w:val="right"/>
+            </w:pPr>
+            <w:r/>
+            <w:r>
+              <w:rPr>
+                <w:b w:val="0"/>
+                <w:sz w:val="18"/>
+              </w:rPr>
+              <w:t>89.7%</w:t>
+            </w:r>
+          </w:p>
+        </w:tc>
+        <w:tc>
+          <w:tcPr>
+            <w:tcW w:type="dxa" w:w="1474"/>
+          </w:tcPr>
+          <w:p>
+            <w:pPr>
+              <w:jc w:val="right"/>
+            </w:pPr>
+            <w:r/>
+            <w:r>
+              <w:rPr>
+                <w:b w:val="0"/>
+                <w:sz w:val="18"/>
+              </w:rPr>
+              <w:t>40.2%</w:t>
+            </w:r>
+          </w:p>
+        </w:tc>
+      </w:tr>
     </w:tbl>
     <w:p>
       <w:pPr>
@@ -3921,7 +4152,7 @@
         <w:rPr>
           <w:i w:val="0"/>
         </w:rPr>
-        <w:t>Holding out every eligible species once confirms the result without depending on a random draw (Table 4, Figure 4). On average NJ wrongly named the missing species for 66.8% of its queries, and for 67% of species it did so for most queries. k-NN (k = 6) did so for 14.4%, never naming a wrong species for 82% of species. Among the 29 species that do not share their barcode, k-NN never named a wrong species for a single query, with either k, and reported the correct genus for 99.2%; NJ wrongly named 62.1%. NJ also placed two species in the wrong genus, Leucorrhinia caudalis (4 queries), Libellula quadrimaculata (30 queries): each was placed next to the other. No classifier and no best-close-match answer named a wrong genus in this analysis.</w:t>
+        <w:t>Holding out every eligible species once confirms the result without depending on a random draw (Table 4, Figure 4). On average NJ wrongly named the missing species for 66.8% of its queries, and for 67% of species it did so for most queries. k-NN (k = 6) did so for 14.4%, never naming a wrong species for 82% of species. Among the 29 species that do not share their barcode, k-NN never named a wrong species for a single query, with either k, and reported the correct genus for 99.2%; plain NJ wrongly named 62.1%. Plain NJ also placed two species in the wrong genus, Leucorrhinia caudalis (4 queries), Libellula quadrimaculata (30 queries): each was placed next to the other. With its cut-off, the tree wrongly named 10.3% of queries overall and 0.0% outside the barcode-sharing groups, and the two wrong-genus placements were flagged 'unknown' instead. NJ + cut-off and k-NN were the two safest methods (10.3–14.4%); the tree was slightly safer on barcode-sharing species (40% against 56% wrongly named). No method with a cut-off named a wrong genus in this analysis.</w:t>
       </w:r>
     </w:p>
     <w:p>
@@ -3996,7 +4227,7 @@
         <w:rPr>
           <w:i w:val="0"/>
         </w:rPr>
-        <w:t>Across the four random Condition B draws, the share of unknown queries wrongly named ranged from 46.4–97.8% for NJ, 0.0–33.2% for k-NN (k = 6), 11.5–41.8% for random forest (k = 6) and 15.8–40.9% for best close match. k-NN was the safest method in all four. The wide ranges come from which species happen to be drawn, as Section 4.5 explains.</w:t>
+        <w:t>Across the four random Condition B draws, the share of unknown queries wrongly named ranged from 46.4–97.8% for plain NJ, 0.0–24.6% for NJ + cut-off, 0.0–33.2% for k-NN (k = 6), 11.5–41.8% for random forest (k = 6) and 15.8–40.9% for best close match. NJ + cut-off or k-NN was the safest method in every draw, and plain NJ never was. The wide ranges come from which species happen to be drawn, as Section 4.5 explains.</w:t>
       </w:r>
     </w:p>
     <w:p>
@@ -4063,7 +4294,7 @@
           <w:color w:val="52514E"/>
           <w:sz w:val="19"/>
         </w:rPr>
-        <w:t>Threshold sensitivity (Condition B, main run). Lines: every possible cut-off; markers: cut-offs calibrated to accept 90%, 95% and 99% of known species (best close match also: Meier's cut-off). NJ has no threshold.</w:t>
+        <w:t>Threshold sensitivity (Condition B, main run). Lines: every possible cut-off; markers: cut-offs calibrated to accept 90%, 95% and 99% of known species (best close match also: Meier's cut-off). The blue diamond is plain NJ, which has no cut-off.</w:t>
       </w:r>
     </w:p>
     <w:p>
@@ -4154,7 +4385,60 @@
         <w:rPr>
           <w:i w:val="0"/>
         </w:rPr>
-        <w:t>Best close match is a distance rule with no learning. With Meier's cut-off it wrongly named 15.8% of unknown queries in the main run and 15.8–40.9% across draws, so it was less safe than k-NN in three of four. Calibrated in the same way as k-NN, however, best close match also flagged 100.0% of unknown queries. The safety therefore comes mainly from having a distance cut-off rather than from machine learning as such. What k-NN adds is fewer losses on known species: at the same safety it kept 87.6% of known queries correct against 76.7% for best close match. k-NN's vote among five neighbours resolves many queries that best close match calls ambiguous.</w:t>
+        <w:t>Three independent lines of evidence point to the same answer: the safety comes from a calibrated 'unknown' cut-off, not from machine learning as such.</w:t>
+      </w:r>
+    </w:p>
+    <w:p>
+      <w:pPr>
+        <w:pStyle w:val="ListBullet"/>
+        <w:spacing w:after="60"/>
+      </w:pPr>
+      <w:r>
+        <w:rPr>
+          <w:b/>
+        </w:rPr>
+        <w:t xml:space="preserve">A plain distance rule. </w:t>
+      </w:r>
+      <w:r>
+        <w:t>Best close match has no learning. With Meier's cut-off it wrongly named 15.8% of unknown queries in the main run and 15.8–40.9% across draws. Calibrated in the same way as k-NN, it also flagged 100.0% of unknown queries.</w:t>
+      </w:r>
+    </w:p>
+    <w:p>
+      <w:pPr>
+        <w:pStyle w:val="ListBullet"/>
+        <w:spacing w:after="60"/>
+      </w:pPr>
+      <w:r>
+        <w:rPr>
+          <w:b/>
+        </w:rPr>
+        <w:t xml:space="preserve">The same tree with a cut-off. </w:t>
+      </w:r>
+      <w:r>
+        <w:t>Plain NJ wrongly named 67% of missing species across 39 species; with a calibrated tree-distance cut-off it wrongly named 10%, slightly fewer than k-NN (14%).</w:t>
+      </w:r>
+    </w:p>
+    <w:p>
+      <w:pPr>
+        <w:pStyle w:val="ListBullet"/>
+        <w:spacing w:after="60"/>
+      </w:pPr>
+      <w:r>
+        <w:rPr>
+          <w:b/>
+        </w:rPr>
+        <w:t xml:space="preserve">The threshold curves. </w:t>
+      </w:r>
+      <w:r>
+        <w:t>Across every possible cut-off, the curves of NJ + cut-off and k-NN almost overlap (Figure 5): at the same rate of wrongly rejected known species, they catch about the same share of unknown species.</w:t>
+      </w:r>
+    </w:p>
+    <w:p>
+      <w:r>
+        <w:rPr>
+          <w:i w:val="0"/>
+        </w:rPr>
+        <w:t>What, then, does machine learning add? First, speed (Section 4.7). Second, a slightly better balance at its calibrated cut-off. With cut-offs on, k-NN kept more known species correct than NJ + cut-off in all 8 seed-and-condition comparisons, by 2.5–6.8 percentage points. These differences are not significant individually, and since the threshold curves overlap, they reflect where each calibration placed its cut-off (the in-tree calibration chose a stricter one), not a better ability to tell known from unknown. Against best close match, k-NN's advantage is clearer: at the same safety it kept 87.6% of known queries correct against 76.7%, because its vote among five neighbours resolves many queries that best close match calls ambiguous.</w:t>
       </w:r>
     </w:p>
     <w:p>
@@ -4245,7 +4529,7 @@
         <w:rPr>
           <w:i w:val="0"/>
         </w:rPr>
-        <w:t>On species that are in the reference database, the choice of method hardly matters: all methods identified about nine in ten queries correctly, and their errors were the same unavoidable confusions between barcode-sharing species. The choice matters when the database is incomplete. A phylogenetic tree has no natural way to say 'this species is not here'. With our rule, it answered with the nearest species in most cases, and twice even with a species of another genus. It abstained only when the neighbouring clade happened to contain several species.</w:t>
+        <w:t>On species that are in the reference database, the choice of method hardly matters: all methods identified about nine in ten queries correctly, and their errors were the same unavoidable confusions between barcode-sharing species. When the database is incomplete, what matters is not the method but whether it has a calibrated way to say 'this species is not here'. A phylogenetic tree used as usual has none. With our rule it answered with the nearest species in most cases, twice even with a species of another genus, and abstained only when the neighbouring clade happened to contain several species. Machine-learning classifiers without a threshold are no better: they always name a known species.</w:t>
       </w:r>
     </w:p>
     <w:p>
@@ -4253,7 +4537,7 @@
         <w:rPr>
           <w:i w:val="0"/>
         </w:rPr>
-        <w:t>Machine-learning classifiers without a threshold are no better: they always name a known species. The decisive ingredient is an explicit 'unknown' cut-off calibrated on known species. With it, k-NN never named a wrong species outside the barcode-sharing groups and kept the useful part of the tree's answer, the genus. Our best-close-match baseline shows that this safety is mainly a property of the cut-off, not of machine learning. The classifier's added value is that it loses fewer known species at the same level of safety. Random forest was less safe than k-NN, because its probabilities spread over related species and do not directly measure how far a query is from the references.</w:t>
+        <w:t>Once every method is given an 'unknown' cut-off calibrated on known species, the picture changes. The tree, k-NN and even a plain distance rule all became safe, and outside the barcode-sharing groups the tree and k-NN never named a wrong species. They also kept the useful part of the tree's answer, the genus. Random forest remained somewhat less safe, because its probabilities spread over related species and do not directly measure how far a query is from the references. Methods that measure distance (k-NN, best close match and the tree) are the natural basis for an 'unknown' answer.</w:t>
       </w:r>
     </w:p>
     <w:p>
@@ -4261,7 +4545,7 @@
         <w:rPr>
           <w:i w:val="0"/>
         </w:rPr>
-        <w:t>For practical identification we therefore recommend a distance-aware method with a calibrated 'unknown' threshold, here k-NN on k-mer frequencies, rather than reading a species name off a tree. Answers that fall within a barcode-sharing group should be reported at genus or species-group level. A tree remains useful for exploring relationships, but it should not be the source of a species name for an unknown query.</w:t>
+        <w:t>Our central recommendation is therefore method-independent: whichever identification method is used, add a calibrated 'unknown' cut-off. Without one, the tree named a wrong species for two thirds of missing species; with one, wrong names fell to about one in ten. If speed matters, k-NN on k-mer frequencies is the practical choice, because it reaches the same safety hundreds of times faster. Answers that fall within a barcode-sharing group should be reported at genus or species-group level.</w:t>
       </w:r>
     </w:p>
     <w:p>
@@ -4269,7 +4553,7 @@
         <w:rPr>
           <w:i w:val="0"/>
         </w:rPr>
-        <w:t>Our results agree with earlier work on this group and on barcoding in general. The European Odonata reference study (PeerJ, 2021) found that most species are identifiable from COI alone, but not all, which matches our accuracy of about nine in ten for known species and the same problem groups. Meier et al. (2006) introduced best close match because tree-based identification overstates success. Our finding that a distance cut-off is what makes identification safe extends their argument to the case of missing species. The machine-learning studies in our reference list report high accuracy on known species. Our results suggest that such accuracy says little about behaviour on species outside the training set, which needs to be tested explicitly.</w:t>
+        <w:t>Our results agree with earlier work on this group and on barcoding in general. The European Odonata reference study (PeerJ, 2021) found that most species are identifiable from COI alone, but not all, which matches our accuracy of about nine in ten for known species and the same problem groups. Meier et al. (2006) introduced best close match because tree-based identification overstates success. Our finding that a distance cut-off is what makes identification safe extends their argument to the case of missing species, and shows that the same fix works for the tree itself. The machine-learning studies in our reference list report high accuracy on known species. Our results suggest that such accuracy says little about behaviour on species outside the training set, which needs to be tested explicitly, and that comparisons between trees and classifiers should give both the same chance to answer 'unknown'.</w:t>
       </w:r>
     </w:p>
     <w:p>
@@ -4342,10 +4626,10 @@
         <w:rPr>
           <w:b/>
         </w:rPr>
-        <w:t xml:space="preserve">Tree method not fully like-for-like. </w:t>
+        <w:t xml:space="preserve">Calibration of the tree cut-off. </w:t>
       </w:r>
       <w:r>
-        <w:t>By design NJ received no extra 'unknown' threshold; a distance threshold on the tree could make it safer. We used a single NJ tree for all queries, not one tree per query, and did not test maximum-likelihood trees.</w:t>
+        <w:t>The tree's cut-off was calibrated inside the same tree on training sequences, while the classifiers used cross-validation; the two procedures placed their cut-offs at slightly different points of the trade-off. We used a single NJ tree for all queries, not one tree per query, and did not test maximum-likelihood trees.</w:t>
       </w:r>
     </w:p>
     <w:p>
@@ -4391,7 +4675,7 @@
         <w:rPr>
           <w:i w:val="0"/>
         </w:rPr>
-        <w:t>Machine learning matched the phylogenetic tree on known species (93% vs 92%) but wrongly named unknown species over four times less often (14% vs 67% across 39 species held out one at a time) and was about 264 times faster. The safety comes mainly from a calibrated distance cut-off. Barcode sharing between close relatives remains the limit that no barcode-only method overcomes.</w:t>
+        <w:t>Which method should be trusted when the species is not in the database? Not the method alone. Without an 'unknown' cut-off, the NJ tree wrongly named 67% of species missing from the database; with a calibrated cut-off, the tree and k-NN were both safe (10% and 14% across 39 species held out one at a time, and 0% outside barcode-sharing groups), and k-NN achieved this about 264 times faster. Whichever method is used, a calibrated 'unknown' cut-off should be part of it. Barcode sharing between close relatives remains the limit that no barcode-only method overcomes.</w:t>
       </w:r>
     </w:p>
     <w:p>
@@ -8846,7 +9130,7 @@
                 <w:b w:val="0"/>
                 <w:sz w:val="18"/>
               </w:rPr>
-              <w:t>-3.1 to +1.4</w:t>
+              <w:t>-3.0 to +1.7</w:t>
             </w:r>
           </w:p>
         </w:tc>
@@ -8950,7 +9234,7 @@
                 <w:b w:val="0"/>
                 <w:sz w:val="18"/>
               </w:rPr>
-              <w:t>-2.3 to +0.8</w:t>
+              <w:t>-2.4 to +0.9</w:t>
             </w:r>
           </w:p>
         </w:tc>
@@ -9054,7 +9338,7 @@
                 <w:b w:val="0"/>
                 <w:sz w:val="18"/>
               </w:rPr>
-              <w:t>-2.8 to +5.6</w:t>
+              <w:t>-2.8 to +5.3</w:t>
             </w:r>
           </w:p>
         </w:tc>
@@ -9158,7 +9442,7 @@
                 <w:b w:val="0"/>
                 <w:sz w:val="18"/>
               </w:rPr>
-              <w:t>-4.3 to +4.2</w:t>
+              <w:t>-3.9 to +4.4</w:t>
             </w:r>
           </w:p>
         </w:tc>
@@ -9262,7 +9546,7 @@
                 <w:b w:val="0"/>
                 <w:sz w:val="18"/>
               </w:rPr>
-              <w:t>-2.1 to +6.8</w:t>
+              <w:t>-1.9 to +6.8</w:t>
             </w:r>
           </w:p>
         </w:tc>
@@ -9366,7 +9650,7 @@
                 <w:b w:val="0"/>
                 <w:sz w:val="18"/>
               </w:rPr>
-              <w:t>-2.9 to +5.8</w:t>
+              <w:t>-3.0 to +5.3</w:t>
             </w:r>
           </w:p>
         </w:tc>
@@ -9470,7 +9754,7 @@
                 <w:b w:val="0"/>
                 <w:sz w:val="18"/>
               </w:rPr>
-              <w:t>-15.2 to +0.0</w:t>
+              <w:t>-15.8 to +0.0</w:t>
             </w:r>
           </w:p>
         </w:tc>
@@ -9506,7 +9790,7 @@
                 <w:b w:val="0"/>
                 <w:sz w:val="18"/>
               </w:rPr>
-              <w:t>0.0013</w:t>
+              <w:t>0.0019</w:t>
             </w:r>
           </w:p>
         </w:tc>
@@ -9574,7 +9858,7 @@
                 <w:b w:val="0"/>
                 <w:sz w:val="18"/>
               </w:rPr>
-              <w:t>-17.6 to +0.5</w:t>
+              <w:t>-17.3 to +0.6</w:t>
             </w:r>
           </w:p>
         </w:tc>
@@ -9610,7 +9894,7 @@
                 <w:b w:val="0"/>
                 <w:sz w:val="18"/>
               </w:rPr>
-              <w:t>0.0022</w:t>
+              <w:t>0.0030</w:t>
             </w:r>
           </w:p>
         </w:tc>
@@ -9678,7 +9962,7 @@
                 <w:b w:val="0"/>
                 <w:sz w:val="18"/>
               </w:rPr>
-              <w:t>-14.2 to +0.0</w:t>
+              <w:t>-14.4 to +0.0</w:t>
             </w:r>
           </w:p>
         </w:tc>
@@ -9714,7 +9998,7 @@
                 <w:b w:val="0"/>
                 <w:sz w:val="18"/>
               </w:rPr>
-              <w:t>0.0108</w:t>
+              <w:t>0.0154</w:t>
             </w:r>
           </w:p>
         </w:tc>
@@ -9731,7 +10015,7 @@
                 <w:b w:val="0"/>
                 <w:sz w:val="18"/>
               </w:rPr>
-              <w:t>Unknown (B): wrongly named</w:t>
+              <w:t>Known (A): correct</w:t>
             </w:r>
           </w:p>
         </w:tc>
@@ -9746,7 +10030,7 @@
                 <w:b w:val="0"/>
                 <w:sz w:val="18"/>
               </w:rPr>
-              <w:t>NJ tree vs k-NN (k=4)</w:t>
+              <w:t>NJ tree + cut-off vs NJ tree</w:t>
             </w:r>
           </w:p>
         </w:tc>
@@ -9764,7 +10048,7 @@
                 <w:b w:val="0"/>
                 <w:sz w:val="18"/>
               </w:rPr>
-              <w:t>+66.9</w:t>
+              <w:t>+0.0</w:t>
             </w:r>
           </w:p>
         </w:tc>
@@ -9782,7 +10066,7 @@
                 <w:b w:val="0"/>
                 <w:sz w:val="18"/>
               </w:rPr>
-              <w:t>+25.8 to +100.0</w:t>
+              <w:t>+0.0 to +0.0</w:t>
             </w:r>
           </w:p>
         </w:tc>
@@ -9800,7 +10084,7 @@
                 <w:b w:val="0"/>
                 <w:sz w:val="18"/>
               </w:rPr>
-              <w:t>93/0</w:t>
+              <w:t>0/0</w:t>
             </w:r>
           </w:p>
         </w:tc>
@@ -9818,7 +10102,7 @@
                 <w:b w:val="0"/>
                 <w:sz w:val="18"/>
               </w:rPr>
-              <w:t>0.0000</w:t>
+              <w:t>1.0000</w:t>
             </w:r>
           </w:p>
         </w:tc>
@@ -9835,7 +10119,7 @@
                 <w:b w:val="0"/>
                 <w:sz w:val="18"/>
               </w:rPr>
-              <w:t>Unknown (B): wrongly named</w:t>
+              <w:t>Known (A): correct</w:t>
             </w:r>
           </w:p>
         </w:tc>
@@ -9850,7 +10134,7 @@
                 <w:b w:val="0"/>
                 <w:sz w:val="18"/>
               </w:rPr>
-              <w:t>NJ tree vs k-NN (k=6)</w:t>
+              <w:t>NJ tree + cut-off vs k-NN (k=6)</w:t>
             </w:r>
           </w:p>
         </w:tc>
@@ -9868,7 +10152,7 @@
                 <w:b w:val="0"/>
                 <w:sz w:val="18"/>
               </w:rPr>
-              <w:t>+66.9</w:t>
+              <w:t>-0.9</w:t>
             </w:r>
           </w:p>
         </w:tc>
@@ -9886,7 +10170,7 @@
                 <w:b w:val="0"/>
                 <w:sz w:val="18"/>
               </w:rPr>
-              <w:t>+27.1 to +100.0</w:t>
+              <w:t>-2.3 to +0.9</w:t>
             </w:r>
           </w:p>
         </w:tc>
@@ -9904,7 +10188,7 @@
                 <w:b w:val="0"/>
                 <w:sz w:val="18"/>
               </w:rPr>
-              <w:t>93/0</w:t>
+              <w:t>5/7</w:t>
             </w:r>
           </w:p>
         </w:tc>
@@ -9922,7 +10206,7 @@
                 <w:b w:val="0"/>
                 <w:sz w:val="18"/>
               </w:rPr>
-              <w:t>0.0000</w:t>
+              <w:t>1.0000</w:t>
             </w:r>
           </w:p>
         </w:tc>
@@ -9939,7 +10223,7 @@
                 <w:b w:val="0"/>
                 <w:sz w:val="18"/>
               </w:rPr>
-              <w:t>Unknown (B): wrongly named</w:t>
+              <w:t>Known (A): correct</w:t>
             </w:r>
           </w:p>
         </w:tc>
@@ -9954,7 +10238,7 @@
                 <w:b w:val="0"/>
                 <w:sz w:val="18"/>
               </w:rPr>
-              <w:t>NJ tree vs RF (k=4)</w:t>
+              <w:t>NJ tree + cut-off vs RF (k=6)</w:t>
             </w:r>
           </w:p>
         </w:tc>
@@ -9972,7 +10256,7 @@
                 <w:b w:val="0"/>
                 <w:sz w:val="18"/>
               </w:rPr>
-              <w:t>+58.3</w:t>
+              <w:t>+0.0</w:t>
             </w:r>
           </w:p>
         </w:tc>
@@ -9990,7 +10274,7 @@
                 <w:b w:val="0"/>
                 <w:sz w:val="18"/>
               </w:rPr>
-              <w:t>+20.7 to +93.0</w:t>
+              <w:t>-4.1 to +4.0</w:t>
             </w:r>
           </w:p>
         </w:tc>
@@ -10008,7 +10292,7 @@
                 <w:b w:val="0"/>
                 <w:sz w:val="18"/>
               </w:rPr>
-              <w:t>81/0</w:t>
+              <w:t>7/7</w:t>
             </w:r>
           </w:p>
         </w:tc>
@@ -10026,7 +10310,7 @@
                 <w:b w:val="0"/>
                 <w:sz w:val="18"/>
               </w:rPr>
-              <w:t>0.0000</w:t>
+              <w:t>1.0000</w:t>
             </w:r>
           </w:p>
         </w:tc>
@@ -10043,7 +10327,7 @@
                 <w:b w:val="0"/>
                 <w:sz w:val="18"/>
               </w:rPr>
-              <w:t>Unknown (B): wrongly named</w:t>
+              <w:t>Known (A): correct</w:t>
             </w:r>
           </w:p>
         </w:tc>
@@ -10058,7 +10342,7 @@
                 <w:b w:val="0"/>
                 <w:sz w:val="18"/>
               </w:rPr>
-              <w:t>NJ tree vs RF (k=6)</w:t>
+              <w:t>NJ tree + cut-off vs Best close match</w:t>
             </w:r>
           </w:p>
         </w:tc>
@@ -10076,7 +10360,7 @@
                 <w:b w:val="0"/>
                 <w:sz w:val="18"/>
               </w:rPr>
-              <w:t>+55.4</w:t>
+              <w:t>+6.8</w:t>
             </w:r>
           </w:p>
         </w:tc>
@@ -10094,7 +10378,7 @@
                 <w:b w:val="0"/>
                 <w:sz w:val="18"/>
               </w:rPr>
-              <w:t>+16.1 to +92.3</w:t>
+              <w:t>+0.0 to +15.4</w:t>
             </w:r>
           </w:p>
         </w:tc>
@@ -10112,7 +10396,7 @@
                 <w:b w:val="0"/>
                 <w:sz w:val="18"/>
               </w:rPr>
-              <w:t>77/0</w:t>
+              <w:t>17/1</w:t>
             </w:r>
           </w:p>
         </w:tc>
@@ -10130,7 +10414,7 @@
                 <w:b w:val="0"/>
                 <w:sz w:val="18"/>
               </w:rPr>
-              <w:t>0.0000</w:t>
+              <w:t>0.0019</w:t>
             </w:r>
           </w:p>
         </w:tc>
@@ -10162,7 +10446,7 @@
                 <w:b w:val="0"/>
                 <w:sz w:val="18"/>
               </w:rPr>
-              <w:t>k-NN (k=4) vs RF (k=4)</w:t>
+              <w:t>NJ tree vs k-NN (k=4)</w:t>
             </w:r>
           </w:p>
         </w:tc>
@@ -10180,7 +10464,7 @@
                 <w:b w:val="0"/>
                 <w:sz w:val="18"/>
               </w:rPr>
-              <w:t>-8.6</w:t>
+              <w:t>+66.9</w:t>
             </w:r>
           </w:p>
         </w:tc>
@@ -10198,7 +10482,7 @@
                 <w:b w:val="0"/>
                 <w:sz w:val="18"/>
               </w:rPr>
-              <w:t>-26.7 to +0.0</w:t>
+              <w:t>+26.5 to +100.0</w:t>
             </w:r>
           </w:p>
         </w:tc>
@@ -10216,7 +10500,7 @@
                 <w:b w:val="0"/>
                 <w:sz w:val="18"/>
               </w:rPr>
-              <w:t>0/12</w:t>
+              <w:t>93/0</w:t>
             </w:r>
           </w:p>
         </w:tc>
@@ -10234,7 +10518,7 @@
                 <w:b w:val="0"/>
                 <w:sz w:val="18"/>
               </w:rPr>
-              <w:t>0.0010</w:t>
+              <w:t>0.0000</w:t>
             </w:r>
           </w:p>
         </w:tc>
@@ -10266,7 +10550,7 @@
                 <w:b w:val="0"/>
                 <w:sz w:val="18"/>
               </w:rPr>
-              <w:t>k-NN (k=6) vs RF (k=6)</w:t>
+              <w:t>NJ tree vs k-NN (k=6)</w:t>
             </w:r>
           </w:p>
         </w:tc>
@@ -10284,7 +10568,7 @@
                 <w:b w:val="0"/>
                 <w:sz w:val="18"/>
               </w:rPr>
-              <w:t>-11.5</w:t>
+              <w:t>+66.9</w:t>
             </w:r>
           </w:p>
         </w:tc>
@@ -10302,7 +10586,7 @@
                 <w:b w:val="0"/>
                 <w:sz w:val="18"/>
               </w:rPr>
-              <w:t>-36.1 to +0.0</w:t>
+              <w:t>+27.1 to +100.0</w:t>
             </w:r>
           </w:p>
         </w:tc>
@@ -10320,7 +10604,7 @@
                 <w:b w:val="0"/>
                 <w:sz w:val="18"/>
               </w:rPr>
-              <w:t>0/16</w:t>
+              <w:t>93/0</w:t>
             </w:r>
           </w:p>
         </w:tc>
@@ -10338,7 +10622,7 @@
                 <w:b w:val="0"/>
                 <w:sz w:val="18"/>
               </w:rPr>
-              <w:t>0.0001</w:t>
+              <w:t>0.0000</w:t>
             </w:r>
           </w:p>
         </w:tc>
@@ -10370,7 +10654,7 @@
                 <w:b w:val="0"/>
                 <w:sz w:val="18"/>
               </w:rPr>
-              <w:t>Best close match vs NJ tree</w:t>
+              <w:t>NJ tree vs RF (k=4)</w:t>
             </w:r>
           </w:p>
         </w:tc>
@@ -10388,7 +10672,7 @@
                 <w:b w:val="0"/>
                 <w:sz w:val="18"/>
               </w:rPr>
-              <w:t>-51.1</w:t>
+              <w:t>+58.3</w:t>
             </w:r>
           </w:p>
         </w:tc>
@@ -10406,7 +10690,7 @@
                 <w:b w:val="0"/>
                 <w:sz w:val="18"/>
               </w:rPr>
-              <w:t>-91.7 to -10.3</w:t>
+              <w:t>+19.3 to +92.4</w:t>
             </w:r>
           </w:p>
         </w:tc>
@@ -10424,7 +10708,7 @@
                 <w:b w:val="0"/>
                 <w:sz w:val="18"/>
               </w:rPr>
-              <w:t>0/71</w:t>
+              <w:t>81/0</w:t>
             </w:r>
           </w:p>
         </w:tc>
@@ -10474,7 +10758,7 @@
                 <w:b w:val="0"/>
                 <w:sz w:val="18"/>
               </w:rPr>
-              <w:t>Best close match vs k-NN (k=6)</w:t>
+              <w:t>NJ tree vs RF (k=6)</w:t>
             </w:r>
           </w:p>
         </w:tc>
@@ -10492,7 +10776,7 @@
                 <w:b w:val="0"/>
                 <w:sz w:val="18"/>
               </w:rPr>
-              <w:t>+15.8</w:t>
+              <w:t>+55.4</w:t>
             </w:r>
           </w:p>
         </w:tc>
@@ -10510,7 +10794,7 @@
                 <w:b w:val="0"/>
                 <w:sz w:val="18"/>
               </w:rPr>
-              <w:t>+0.0 to +50.8</w:t>
+              <w:t>+16.4 to +91.0</w:t>
             </w:r>
           </w:p>
         </w:tc>
@@ -10528,7 +10812,7 @@
                 <w:b w:val="0"/>
                 <w:sz w:val="18"/>
               </w:rPr>
-              <w:t>22/0</w:t>
+              <w:t>77/0</w:t>
             </w:r>
           </w:p>
         </w:tc>
@@ -10578,7 +10862,7 @@
                 <w:b w:val="0"/>
                 <w:sz w:val="18"/>
               </w:rPr>
-              <w:t>Best close match vs RF (k=6)</w:t>
+              <w:t>k-NN (k=4) vs RF (k=4)</w:t>
             </w:r>
           </w:p>
         </w:tc>
@@ -10596,7 +10880,7 @@
                 <w:b w:val="0"/>
                 <w:sz w:val="18"/>
               </w:rPr>
-              <w:t>+4.3</w:t>
+              <w:t>-8.6</w:t>
             </w:r>
           </w:p>
         </w:tc>
@@ -10614,7 +10898,7 @@
                 <w:b w:val="0"/>
                 <w:sz w:val="18"/>
               </w:rPr>
-              <w:t>+0.0 to +15.8</w:t>
+              <w:t>-26.5 to +0.0</w:t>
             </w:r>
           </w:p>
         </w:tc>
@@ -10632,7 +10916,7 @@
                 <w:b w:val="0"/>
                 <w:sz w:val="18"/>
               </w:rPr>
-              <w:t>6/0</w:t>
+              <w:t>0/12</w:t>
             </w:r>
           </w:p>
         </w:tc>
@@ -10650,7 +10934,7 @@
                 <w:b w:val="0"/>
                 <w:sz w:val="18"/>
               </w:rPr>
-              <w:t>0.0312</w:t>
+              <w:t>0.0015</w:t>
             </w:r>
           </w:p>
         </w:tc>
@@ -10667,7 +10951,7 @@
                 <w:b w:val="0"/>
                 <w:sz w:val="18"/>
               </w:rPr>
-              <w:t>Known (B): correct</w:t>
+              <w:t>Unknown (B): wrongly named</w:t>
             </w:r>
           </w:p>
         </w:tc>
@@ -10682,7 +10966,7 @@
                 <w:b w:val="0"/>
                 <w:sz w:val="18"/>
               </w:rPr>
-              <w:t>NJ tree vs k-NN (k=4)</w:t>
+              <w:t>k-NN (k=6) vs RF (k=6)</w:t>
             </w:r>
           </w:p>
         </w:tc>
@@ -10700,7 +10984,7 @@
                 <w:b w:val="0"/>
                 <w:sz w:val="18"/>
               </w:rPr>
-              <w:t>+4.7</w:t>
+              <w:t>-11.5</w:t>
             </w:r>
           </w:p>
         </w:tc>
@@ -10718,7 +11002,7 @@
                 <w:b w:val="0"/>
                 <w:sz w:val="18"/>
               </w:rPr>
-              <w:t>+0.5 to +10.1</w:t>
+              <w:t>-34.9 to +0.0</w:t>
             </w:r>
           </w:p>
         </w:tc>
@@ -10736,7 +11020,7 @@
                 <w:b w:val="0"/>
                 <w:sz w:val="18"/>
               </w:rPr>
-              <w:t>15/6</w:t>
+              <w:t>0/16</w:t>
             </w:r>
           </w:p>
         </w:tc>
@@ -10754,7 +11038,7 @@
                 <w:b w:val="0"/>
                 <w:sz w:val="18"/>
               </w:rPr>
-              <w:t>0.3835</w:t>
+              <w:t>0.0002</w:t>
             </w:r>
           </w:p>
         </w:tc>
@@ -10771,7 +11055,7 @@
                 <w:b w:val="0"/>
                 <w:sz w:val="18"/>
               </w:rPr>
-              <w:t>Known (B): correct</w:t>
+              <w:t>Unknown (B): wrongly named</w:t>
             </w:r>
           </w:p>
         </w:tc>
@@ -10786,7 +11070,7 @@
                 <w:b w:val="0"/>
                 <w:sz w:val="18"/>
               </w:rPr>
-              <w:t>NJ tree vs k-NN (k=6)</w:t>
+              <w:t>Best close match vs NJ tree</w:t>
             </w:r>
           </w:p>
         </w:tc>
@@ -10804,7 +11088,7 @@
                 <w:b w:val="0"/>
                 <w:sz w:val="18"/>
               </w:rPr>
-              <w:t>+4.7</w:t>
+              <w:t>-51.1</w:t>
             </w:r>
           </w:p>
         </w:tc>
@@ -10822,7 +11106,7 @@
                 <w:b w:val="0"/>
                 <w:sz w:val="18"/>
               </w:rPr>
-              <w:t>+0.6 to +9.6</w:t>
+              <w:t>-91.8 to -9.3</w:t>
             </w:r>
           </w:p>
         </w:tc>
@@ -10840,7 +11124,7 @@
                 <w:b w:val="0"/>
                 <w:sz w:val="18"/>
               </w:rPr>
-              <w:t>15/6</w:t>
+              <w:t>0/71</w:t>
             </w:r>
           </w:p>
         </w:tc>
@@ -10858,7 +11142,7 @@
                 <w:b w:val="0"/>
                 <w:sz w:val="18"/>
               </w:rPr>
-              <w:t>0.3835</w:t>
+              <w:t>0.0000</w:t>
             </w:r>
           </w:p>
         </w:tc>
@@ -10875,7 +11159,7 @@
                 <w:b w:val="0"/>
                 <w:sz w:val="18"/>
               </w:rPr>
-              <w:t>Known (B): correct</w:t>
+              <w:t>Unknown (B): wrongly named</w:t>
             </w:r>
           </w:p>
         </w:tc>
@@ -10890,7 +11174,7 @@
                 <w:b w:val="0"/>
                 <w:sz w:val="18"/>
               </w:rPr>
-              <w:t>NJ tree vs RF (k=4)</w:t>
+              <w:t>Best close match vs k-NN (k=6)</w:t>
             </w:r>
           </w:p>
         </w:tc>
@@ -10908,7 +11192,7 @@
                 <w:b w:val="0"/>
                 <w:sz w:val="18"/>
               </w:rPr>
-              <w:t>+5.7</w:t>
+              <w:t>+15.8</w:t>
             </w:r>
           </w:p>
         </w:tc>
@@ -10926,7 +11210,7 @@
                 <w:b w:val="0"/>
                 <w:sz w:val="18"/>
               </w:rPr>
-              <w:t>+1.0 to +11.9</w:t>
+              <w:t>+0.0 to +51.3</w:t>
             </w:r>
           </w:p>
         </w:tc>
@@ -10944,7 +11228,7 @@
                 <w:b w:val="0"/>
                 <w:sz w:val="18"/>
               </w:rPr>
-              <w:t>14/3</w:t>
+              <w:t>22/0</w:t>
             </w:r>
           </w:p>
         </w:tc>
@@ -10962,7 +11246,7 @@
                 <w:b w:val="0"/>
                 <w:sz w:val="18"/>
               </w:rPr>
-              <w:t>0.1018</w:t>
+              <w:t>0.0000</w:t>
             </w:r>
           </w:p>
         </w:tc>
@@ -10979,7 +11263,7 @@
                 <w:b w:val="0"/>
                 <w:sz w:val="18"/>
               </w:rPr>
-              <w:t>Known (B): correct</w:t>
+              <w:t>Unknown (B): wrongly named</w:t>
             </w:r>
           </w:p>
         </w:tc>
@@ -10994,7 +11278,7 @@
                 <w:b w:val="0"/>
                 <w:sz w:val="18"/>
               </w:rPr>
-              <w:t>NJ tree vs RF (k=6)</w:t>
+              <w:t>Best close match vs RF (k=6)</w:t>
             </w:r>
           </w:p>
         </w:tc>
@@ -11012,7 +11296,7 @@
                 <w:b w:val="0"/>
                 <w:sz w:val="18"/>
               </w:rPr>
-              <w:t>+5.2</w:t>
+              <w:t>+4.3</w:t>
             </w:r>
           </w:p>
         </w:tc>
@@ -11030,7 +11314,7 @@
                 <w:b w:val="0"/>
                 <w:sz w:val="18"/>
               </w:rPr>
-              <w:t>+1.1 to +10.3</w:t>
+              <w:t>+0.0 to +14.6</w:t>
             </w:r>
           </w:p>
         </w:tc>
@@ -11048,7 +11332,7 @@
                 <w:b w:val="0"/>
                 <w:sz w:val="18"/>
               </w:rPr>
-              <w:t>13/3</w:t>
+              <w:t>6/0</w:t>
             </w:r>
           </w:p>
         </w:tc>
@@ -11066,7 +11350,7 @@
                 <w:b w:val="0"/>
                 <w:sz w:val="18"/>
               </w:rPr>
-              <w:t>0.1489</w:t>
+              <w:t>0.0625</w:t>
             </w:r>
           </w:p>
         </w:tc>
@@ -11083,7 +11367,7 @@
                 <w:b w:val="0"/>
                 <w:sz w:val="18"/>
               </w:rPr>
-              <w:t>Known (B): correct</w:t>
+              <w:t>Unknown (B): wrongly named</w:t>
             </w:r>
           </w:p>
         </w:tc>
@@ -11098,7 +11382,7 @@
                 <w:b w:val="0"/>
                 <w:sz w:val="18"/>
               </w:rPr>
-              <w:t>k-NN (k=4) vs RF (k=4)</w:t>
+              <w:t>NJ tree + cut-off vs NJ tree</w:t>
             </w:r>
           </w:p>
         </w:tc>
@@ -11116,7 +11400,7 @@
                 <w:b w:val="0"/>
                 <w:sz w:val="18"/>
               </w:rPr>
-              <w:t>+1.0</w:t>
+              <w:t>-66.9</w:t>
             </w:r>
           </w:p>
         </w:tc>
@@ -11134,7 +11418,7 @@
                 <w:b w:val="0"/>
                 <w:sz w:val="18"/>
               </w:rPr>
-              <w:t>-6.7 to +9.4</w:t>
+              <w:t>-100.0 to -25.0</w:t>
             </w:r>
           </w:p>
         </w:tc>
@@ -11152,7 +11436,7 @@
                 <w:b w:val="0"/>
                 <w:sz w:val="18"/>
               </w:rPr>
-              <w:t>11/9</w:t>
+              <w:t>0/93</w:t>
             </w:r>
           </w:p>
         </w:tc>
@@ -11170,7 +11454,7 @@
                 <w:b w:val="0"/>
                 <w:sz w:val="18"/>
               </w:rPr>
-              <w:t>1.0000</w:t>
+              <w:t>0.0000</w:t>
             </w:r>
           </w:p>
         </w:tc>
@@ -11187,7 +11471,7 @@
                 <w:b w:val="0"/>
                 <w:sz w:val="18"/>
               </w:rPr>
-              <w:t>Known (B): correct</w:t>
+              <w:t>Unknown (B): wrongly named</w:t>
             </w:r>
           </w:p>
         </w:tc>
@@ -11202,7 +11486,7 @@
                 <w:b w:val="0"/>
                 <w:sz w:val="18"/>
               </w:rPr>
-              <w:t>k-NN (k=6) vs RF (k=6)</w:t>
+              <w:t>NJ tree + cut-off vs k-NN (k=6)</w:t>
             </w:r>
           </w:p>
         </w:tc>
@@ -11220,7 +11504,7 @@
                 <w:b w:val="0"/>
                 <w:sz w:val="18"/>
               </w:rPr>
-              <w:t>+0.5</w:t>
+              <w:t>+0.0</w:t>
             </w:r>
           </w:p>
         </w:tc>
@@ -11238,7 +11522,7 @@
                 <w:b w:val="0"/>
                 <w:sz w:val="18"/>
               </w:rPr>
-              <w:t>-6.4 to +8.2</w:t>
+              <w:t>+0.0 to +0.0</w:t>
             </w:r>
           </w:p>
         </w:tc>
@@ -11256,7 +11540,7 @@
                 <w:b w:val="0"/>
                 <w:sz w:val="18"/>
               </w:rPr>
-              <w:t>9/8</w:t>
+              <w:t>0/0</w:t>
             </w:r>
           </w:p>
         </w:tc>
@@ -11291,7 +11575,7 @@
                 <w:b w:val="0"/>
                 <w:sz w:val="18"/>
               </w:rPr>
-              <w:t>Known (B): correct</w:t>
+              <w:t>Unknown (B): wrongly named</w:t>
             </w:r>
           </w:p>
         </w:tc>
@@ -11306,7 +11590,7 @@
                 <w:b w:val="0"/>
                 <w:sz w:val="18"/>
               </w:rPr>
-              <w:t>Best close match vs NJ tree</w:t>
+              <w:t>NJ tree + cut-off vs RF (k=6)</w:t>
             </w:r>
           </w:p>
         </w:tc>
@@ -11324,7 +11608,7 @@
                 <w:b w:val="0"/>
                 <w:sz w:val="18"/>
               </w:rPr>
-              <w:t>-10.4</w:t>
+              <w:t>-11.5</w:t>
             </w:r>
           </w:p>
         </w:tc>
@@ -11342,7 +11626,7 @@
                 <w:b w:val="0"/>
                 <w:sz w:val="18"/>
               </w:rPr>
-              <w:t>-22.8 to +0.0</w:t>
+              <w:t>-35.6 to +0.0</w:t>
             </w:r>
           </w:p>
         </w:tc>
@@ -11360,7 +11644,7 @@
                 <w:b w:val="0"/>
                 <w:sz w:val="18"/>
               </w:rPr>
-              <w:t>1/21</w:t>
+              <w:t>0/16</w:t>
             </w:r>
           </w:p>
         </w:tc>
@@ -11378,7 +11662,7 @@
                 <w:b w:val="0"/>
                 <w:sz w:val="18"/>
               </w:rPr>
-              <w:t>0.0001</w:t>
+              <w:t>0.0002</w:t>
             </w:r>
           </w:p>
         </w:tc>
@@ -11395,7 +11679,7 @@
                 <w:b w:val="0"/>
                 <w:sz w:val="18"/>
               </w:rPr>
-              <w:t>Known (B): correct</w:t>
+              <w:t>Unknown (B): wrongly named</w:t>
             </w:r>
           </w:p>
         </w:tc>
@@ -11410,7 +11694,7 @@
                 <w:b w:val="0"/>
                 <w:sz w:val="18"/>
               </w:rPr>
-              <w:t>Best close match vs k-NN (k=6)</w:t>
+              <w:t>NJ tree + cut-off vs Best close match</w:t>
             </w:r>
           </w:p>
         </w:tc>
@@ -11428,7 +11712,7 @@
                 <w:b w:val="0"/>
                 <w:sz w:val="18"/>
               </w:rPr>
-              <w:t>-5.7</w:t>
+              <w:t>-15.8</w:t>
             </w:r>
           </w:p>
         </w:tc>
@@ -11446,7 +11730,7 @@
                 <w:b w:val="0"/>
                 <w:sz w:val="18"/>
               </w:rPr>
-              <w:t>-17.9 to +6.0</w:t>
+              <w:t>-49.4 to +0.0</w:t>
             </w:r>
           </w:p>
         </w:tc>
@@ -11464,7 +11748,7 @@
                 <w:b w:val="0"/>
                 <w:sz w:val="18"/>
               </w:rPr>
-              <w:t>10/21</w:t>
+              <w:t>0/22</w:t>
             </w:r>
           </w:p>
         </w:tc>
@@ -11482,7 +11766,7 @@
                 <w:b w:val="0"/>
                 <w:sz w:val="18"/>
               </w:rPr>
-              <w:t>0.3835</w:t>
+              <w:t>0.0000</w:t>
             </w:r>
           </w:p>
         </w:tc>
@@ -11514,6 +11798,838 @@
                 <w:b w:val="0"/>
                 <w:sz w:val="18"/>
               </w:rPr>
+              <w:t>NJ tree vs k-NN (k=4)</w:t>
+            </w:r>
+          </w:p>
+        </w:tc>
+        <w:tc>
+          <w:tcPr>
+            <w:tcW w:type="dxa" w:w="1247"/>
+          </w:tcPr>
+          <w:p>
+            <w:pPr>
+              <w:jc w:val="right"/>
+            </w:pPr>
+            <w:r/>
+            <w:r>
+              <w:rPr>
+                <w:b w:val="0"/>
+                <w:sz w:val="18"/>
+              </w:rPr>
+              <w:t>+4.7</w:t>
+            </w:r>
+          </w:p>
+        </w:tc>
+        <w:tc>
+          <w:tcPr>
+            <w:tcW w:type="dxa" w:w="1587"/>
+          </w:tcPr>
+          <w:p>
+            <w:pPr>
+              <w:jc w:val="right"/>
+            </w:pPr>
+            <w:r/>
+            <w:r>
+              <w:rPr>
+                <w:b w:val="0"/>
+                <w:sz w:val="18"/>
+              </w:rPr>
+              <w:t>+0.4 to +10.0</w:t>
+            </w:r>
+          </w:p>
+        </w:tc>
+        <w:tc>
+          <w:tcPr>
+            <w:tcW w:type="dxa" w:w="1134"/>
+          </w:tcPr>
+          <w:p>
+            <w:pPr>
+              <w:jc w:val="right"/>
+            </w:pPr>
+            <w:r/>
+            <w:r>
+              <w:rPr>
+                <w:b w:val="0"/>
+                <w:sz w:val="18"/>
+              </w:rPr>
+              <w:t>15/6</w:t>
+            </w:r>
+          </w:p>
+        </w:tc>
+        <w:tc>
+          <w:tcPr>
+            <w:tcW w:type="dxa" w:w="907"/>
+          </w:tcPr>
+          <w:p>
+            <w:pPr>
+              <w:jc w:val="right"/>
+            </w:pPr>
+            <w:r/>
+            <w:r>
+              <w:rPr>
+                <w:b w:val="0"/>
+                <w:sz w:val="18"/>
+              </w:rPr>
+              <w:t>0.5752</w:t>
+            </w:r>
+          </w:p>
+        </w:tc>
+      </w:tr>
+      <w:tr>
+        <w:tc>
+          <w:tcPr>
+            <w:tcW w:type="dxa" w:w="1928"/>
+          </w:tcPr>
+          <w:p>
+            <w:r/>
+            <w:r>
+              <w:rPr>
+                <w:b w:val="0"/>
+                <w:sz w:val="18"/>
+              </w:rPr>
+              <w:t>Known (B): correct</w:t>
+            </w:r>
+          </w:p>
+        </w:tc>
+        <w:tc>
+          <w:tcPr>
+            <w:tcW w:type="dxa" w:w="2608"/>
+          </w:tcPr>
+          <w:p>
+            <w:r/>
+            <w:r>
+              <w:rPr>
+                <w:b w:val="0"/>
+                <w:sz w:val="18"/>
+              </w:rPr>
+              <w:t>NJ tree vs k-NN (k=6)</w:t>
+            </w:r>
+          </w:p>
+        </w:tc>
+        <w:tc>
+          <w:tcPr>
+            <w:tcW w:type="dxa" w:w="1247"/>
+          </w:tcPr>
+          <w:p>
+            <w:pPr>
+              <w:jc w:val="right"/>
+            </w:pPr>
+            <w:r/>
+            <w:r>
+              <w:rPr>
+                <w:b w:val="0"/>
+                <w:sz w:val="18"/>
+              </w:rPr>
+              <w:t>+4.7</w:t>
+            </w:r>
+          </w:p>
+        </w:tc>
+        <w:tc>
+          <w:tcPr>
+            <w:tcW w:type="dxa" w:w="1587"/>
+          </w:tcPr>
+          <w:p>
+            <w:pPr>
+              <w:jc w:val="right"/>
+            </w:pPr>
+            <w:r/>
+            <w:r>
+              <w:rPr>
+                <w:b w:val="0"/>
+                <w:sz w:val="18"/>
+              </w:rPr>
+              <w:t>+0.8 to +9.7</w:t>
+            </w:r>
+          </w:p>
+        </w:tc>
+        <w:tc>
+          <w:tcPr>
+            <w:tcW w:type="dxa" w:w="1134"/>
+          </w:tcPr>
+          <w:p>
+            <w:pPr>
+              <w:jc w:val="right"/>
+            </w:pPr>
+            <w:r/>
+            <w:r>
+              <w:rPr>
+                <w:b w:val="0"/>
+                <w:sz w:val="18"/>
+              </w:rPr>
+              <w:t>15/6</w:t>
+            </w:r>
+          </w:p>
+        </w:tc>
+        <w:tc>
+          <w:tcPr>
+            <w:tcW w:type="dxa" w:w="907"/>
+          </w:tcPr>
+          <w:p>
+            <w:pPr>
+              <w:jc w:val="right"/>
+            </w:pPr>
+            <w:r/>
+            <w:r>
+              <w:rPr>
+                <w:b w:val="0"/>
+                <w:sz w:val="18"/>
+              </w:rPr>
+              <w:t>0.5752</w:t>
+            </w:r>
+          </w:p>
+        </w:tc>
+      </w:tr>
+      <w:tr>
+        <w:tc>
+          <w:tcPr>
+            <w:tcW w:type="dxa" w:w="1928"/>
+          </w:tcPr>
+          <w:p>
+            <w:r/>
+            <w:r>
+              <w:rPr>
+                <w:b w:val="0"/>
+                <w:sz w:val="18"/>
+              </w:rPr>
+              <w:t>Known (B): correct</w:t>
+            </w:r>
+          </w:p>
+        </w:tc>
+        <w:tc>
+          <w:tcPr>
+            <w:tcW w:type="dxa" w:w="2608"/>
+          </w:tcPr>
+          <w:p>
+            <w:r/>
+            <w:r>
+              <w:rPr>
+                <w:b w:val="0"/>
+                <w:sz w:val="18"/>
+              </w:rPr>
+              <w:t>NJ tree vs RF (k=4)</w:t>
+            </w:r>
+          </w:p>
+        </w:tc>
+        <w:tc>
+          <w:tcPr>
+            <w:tcW w:type="dxa" w:w="1247"/>
+          </w:tcPr>
+          <w:p>
+            <w:pPr>
+              <w:jc w:val="right"/>
+            </w:pPr>
+            <w:r/>
+            <w:r>
+              <w:rPr>
+                <w:b w:val="0"/>
+                <w:sz w:val="18"/>
+              </w:rPr>
+              <w:t>+5.7</w:t>
+            </w:r>
+          </w:p>
+        </w:tc>
+        <w:tc>
+          <w:tcPr>
+            <w:tcW w:type="dxa" w:w="1587"/>
+          </w:tcPr>
+          <w:p>
+            <w:pPr>
+              <w:jc w:val="right"/>
+            </w:pPr>
+            <w:r/>
+            <w:r>
+              <w:rPr>
+                <w:b w:val="0"/>
+                <w:sz w:val="18"/>
+              </w:rPr>
+              <w:t>+1.1 to +11.6</w:t>
+            </w:r>
+          </w:p>
+        </w:tc>
+        <w:tc>
+          <w:tcPr>
+            <w:tcW w:type="dxa" w:w="1134"/>
+          </w:tcPr>
+          <w:p>
+            <w:pPr>
+              <w:jc w:val="right"/>
+            </w:pPr>
+            <w:r/>
+            <w:r>
+              <w:rPr>
+                <w:b w:val="0"/>
+                <w:sz w:val="18"/>
+              </w:rPr>
+              <w:t>14/3</w:t>
+            </w:r>
+          </w:p>
+        </w:tc>
+        <w:tc>
+          <w:tcPr>
+            <w:tcW w:type="dxa" w:w="907"/>
+          </w:tcPr>
+          <w:p>
+            <w:pPr>
+              <w:jc w:val="right"/>
+            </w:pPr>
+            <w:r/>
+            <w:r>
+              <w:rPr>
+                <w:b w:val="0"/>
+                <w:sz w:val="18"/>
+              </w:rPr>
+              <w:t>0.1400</w:t>
+            </w:r>
+          </w:p>
+        </w:tc>
+      </w:tr>
+      <w:tr>
+        <w:tc>
+          <w:tcPr>
+            <w:tcW w:type="dxa" w:w="1928"/>
+          </w:tcPr>
+          <w:p>
+            <w:r/>
+            <w:r>
+              <w:rPr>
+                <w:b w:val="0"/>
+                <w:sz w:val="18"/>
+              </w:rPr>
+              <w:t>Known (B): correct</w:t>
+            </w:r>
+          </w:p>
+        </w:tc>
+        <w:tc>
+          <w:tcPr>
+            <w:tcW w:type="dxa" w:w="2608"/>
+          </w:tcPr>
+          <w:p>
+            <w:r/>
+            <w:r>
+              <w:rPr>
+                <w:b w:val="0"/>
+                <w:sz w:val="18"/>
+              </w:rPr>
+              <w:t>NJ tree vs RF (k=6)</w:t>
+            </w:r>
+          </w:p>
+        </w:tc>
+        <w:tc>
+          <w:tcPr>
+            <w:tcW w:type="dxa" w:w="1247"/>
+          </w:tcPr>
+          <w:p>
+            <w:pPr>
+              <w:jc w:val="right"/>
+            </w:pPr>
+            <w:r/>
+            <w:r>
+              <w:rPr>
+                <w:b w:val="0"/>
+                <w:sz w:val="18"/>
+              </w:rPr>
+              <w:t>+5.2</w:t>
+            </w:r>
+          </w:p>
+        </w:tc>
+        <w:tc>
+          <w:tcPr>
+            <w:tcW w:type="dxa" w:w="1587"/>
+          </w:tcPr>
+          <w:p>
+            <w:pPr>
+              <w:jc w:val="right"/>
+            </w:pPr>
+            <w:r/>
+            <w:r>
+              <w:rPr>
+                <w:b w:val="0"/>
+                <w:sz w:val="18"/>
+              </w:rPr>
+              <w:t>+1.0 to +10.4</w:t>
+            </w:r>
+          </w:p>
+        </w:tc>
+        <w:tc>
+          <w:tcPr>
+            <w:tcW w:type="dxa" w:w="1134"/>
+          </w:tcPr>
+          <w:p>
+            <w:pPr>
+              <w:jc w:val="right"/>
+            </w:pPr>
+            <w:r/>
+            <w:r>
+              <w:rPr>
+                <w:b w:val="0"/>
+                <w:sz w:val="18"/>
+              </w:rPr>
+              <w:t>13/3</w:t>
+            </w:r>
+          </w:p>
+        </w:tc>
+        <w:tc>
+          <w:tcPr>
+            <w:tcW w:type="dxa" w:w="907"/>
+          </w:tcPr>
+          <w:p>
+            <w:pPr>
+              <w:jc w:val="right"/>
+            </w:pPr>
+            <w:r/>
+            <w:r>
+              <w:rPr>
+                <w:b w:val="0"/>
+                <w:sz w:val="18"/>
+              </w:rPr>
+              <w:t>0.2127</w:t>
+            </w:r>
+          </w:p>
+        </w:tc>
+      </w:tr>
+      <w:tr>
+        <w:tc>
+          <w:tcPr>
+            <w:tcW w:type="dxa" w:w="1928"/>
+          </w:tcPr>
+          <w:p>
+            <w:r/>
+            <w:r>
+              <w:rPr>
+                <w:b w:val="0"/>
+                <w:sz w:val="18"/>
+              </w:rPr>
+              <w:t>Known (B): correct</w:t>
+            </w:r>
+          </w:p>
+        </w:tc>
+        <w:tc>
+          <w:tcPr>
+            <w:tcW w:type="dxa" w:w="2608"/>
+          </w:tcPr>
+          <w:p>
+            <w:r/>
+            <w:r>
+              <w:rPr>
+                <w:b w:val="0"/>
+                <w:sz w:val="18"/>
+              </w:rPr>
+              <w:t>k-NN (k=4) vs RF (k=4)</w:t>
+            </w:r>
+          </w:p>
+        </w:tc>
+        <w:tc>
+          <w:tcPr>
+            <w:tcW w:type="dxa" w:w="1247"/>
+          </w:tcPr>
+          <w:p>
+            <w:pPr>
+              <w:jc w:val="right"/>
+            </w:pPr>
+            <w:r/>
+            <w:r>
+              <w:rPr>
+                <w:b w:val="0"/>
+                <w:sz w:val="18"/>
+              </w:rPr>
+              <w:t>+1.0</w:t>
+            </w:r>
+          </w:p>
+        </w:tc>
+        <w:tc>
+          <w:tcPr>
+            <w:tcW w:type="dxa" w:w="1587"/>
+          </w:tcPr>
+          <w:p>
+            <w:pPr>
+              <w:jc w:val="right"/>
+            </w:pPr>
+            <w:r/>
+            <w:r>
+              <w:rPr>
+                <w:b w:val="0"/>
+                <w:sz w:val="18"/>
+              </w:rPr>
+              <w:t>-6.5 to +9.5</w:t>
+            </w:r>
+          </w:p>
+        </w:tc>
+        <w:tc>
+          <w:tcPr>
+            <w:tcW w:type="dxa" w:w="1134"/>
+          </w:tcPr>
+          <w:p>
+            <w:pPr>
+              <w:jc w:val="right"/>
+            </w:pPr>
+            <w:r/>
+            <w:r>
+              <w:rPr>
+                <w:b w:val="0"/>
+                <w:sz w:val="18"/>
+              </w:rPr>
+              <w:t>11/9</w:t>
+            </w:r>
+          </w:p>
+        </w:tc>
+        <w:tc>
+          <w:tcPr>
+            <w:tcW w:type="dxa" w:w="907"/>
+          </w:tcPr>
+          <w:p>
+            <w:pPr>
+              <w:jc w:val="right"/>
+            </w:pPr>
+            <w:r/>
+            <w:r>
+              <w:rPr>
+                <w:b w:val="0"/>
+                <w:sz w:val="18"/>
+              </w:rPr>
+              <w:t>1.0000</w:t>
+            </w:r>
+          </w:p>
+        </w:tc>
+      </w:tr>
+      <w:tr>
+        <w:tc>
+          <w:tcPr>
+            <w:tcW w:type="dxa" w:w="1928"/>
+          </w:tcPr>
+          <w:p>
+            <w:r/>
+            <w:r>
+              <w:rPr>
+                <w:b w:val="0"/>
+                <w:sz w:val="18"/>
+              </w:rPr>
+              <w:t>Known (B): correct</w:t>
+            </w:r>
+          </w:p>
+        </w:tc>
+        <w:tc>
+          <w:tcPr>
+            <w:tcW w:type="dxa" w:w="2608"/>
+          </w:tcPr>
+          <w:p>
+            <w:r/>
+            <w:r>
+              <w:rPr>
+                <w:b w:val="0"/>
+                <w:sz w:val="18"/>
+              </w:rPr>
+              <w:t>k-NN (k=6) vs RF (k=6)</w:t>
+            </w:r>
+          </w:p>
+        </w:tc>
+        <w:tc>
+          <w:tcPr>
+            <w:tcW w:type="dxa" w:w="1247"/>
+          </w:tcPr>
+          <w:p>
+            <w:pPr>
+              <w:jc w:val="right"/>
+            </w:pPr>
+            <w:r/>
+            <w:r>
+              <w:rPr>
+                <w:b w:val="0"/>
+                <w:sz w:val="18"/>
+              </w:rPr>
+              <w:t>+0.5</w:t>
+            </w:r>
+          </w:p>
+        </w:tc>
+        <w:tc>
+          <w:tcPr>
+            <w:tcW w:type="dxa" w:w="1587"/>
+          </w:tcPr>
+          <w:p>
+            <w:pPr>
+              <w:jc w:val="right"/>
+            </w:pPr>
+            <w:r/>
+            <w:r>
+              <w:rPr>
+                <w:b w:val="0"/>
+                <w:sz w:val="18"/>
+              </w:rPr>
+              <w:t>-6.3 to +7.6</w:t>
+            </w:r>
+          </w:p>
+        </w:tc>
+        <w:tc>
+          <w:tcPr>
+            <w:tcW w:type="dxa" w:w="1134"/>
+          </w:tcPr>
+          <w:p>
+            <w:pPr>
+              <w:jc w:val="right"/>
+            </w:pPr>
+            <w:r/>
+            <w:r>
+              <w:rPr>
+                <w:b w:val="0"/>
+                <w:sz w:val="18"/>
+              </w:rPr>
+              <w:t>9/8</w:t>
+            </w:r>
+          </w:p>
+        </w:tc>
+        <w:tc>
+          <w:tcPr>
+            <w:tcW w:type="dxa" w:w="907"/>
+          </w:tcPr>
+          <w:p>
+            <w:pPr>
+              <w:jc w:val="right"/>
+            </w:pPr>
+            <w:r/>
+            <w:r>
+              <w:rPr>
+                <w:b w:val="0"/>
+                <w:sz w:val="18"/>
+              </w:rPr>
+              <w:t>1.0000</w:t>
+            </w:r>
+          </w:p>
+        </w:tc>
+      </w:tr>
+      <w:tr>
+        <w:tc>
+          <w:tcPr>
+            <w:tcW w:type="dxa" w:w="1928"/>
+          </w:tcPr>
+          <w:p>
+            <w:r/>
+            <w:r>
+              <w:rPr>
+                <w:b w:val="0"/>
+                <w:sz w:val="18"/>
+              </w:rPr>
+              <w:t>Known (B): correct</w:t>
+            </w:r>
+          </w:p>
+        </w:tc>
+        <w:tc>
+          <w:tcPr>
+            <w:tcW w:type="dxa" w:w="2608"/>
+          </w:tcPr>
+          <w:p>
+            <w:r/>
+            <w:r>
+              <w:rPr>
+                <w:b w:val="0"/>
+                <w:sz w:val="18"/>
+              </w:rPr>
+              <w:t>Best close match vs NJ tree</w:t>
+            </w:r>
+          </w:p>
+        </w:tc>
+        <w:tc>
+          <w:tcPr>
+            <w:tcW w:type="dxa" w:w="1247"/>
+          </w:tcPr>
+          <w:p>
+            <w:pPr>
+              <w:jc w:val="right"/>
+            </w:pPr>
+            <w:r/>
+            <w:r>
+              <w:rPr>
+                <w:b w:val="0"/>
+                <w:sz w:val="18"/>
+              </w:rPr>
+              <w:t>-10.4</w:t>
+            </w:r>
+          </w:p>
+        </w:tc>
+        <w:tc>
+          <w:tcPr>
+            <w:tcW w:type="dxa" w:w="1587"/>
+          </w:tcPr>
+          <w:p>
+            <w:pPr>
+              <w:jc w:val="right"/>
+            </w:pPr>
+            <w:r/>
+            <w:r>
+              <w:rPr>
+                <w:b w:val="0"/>
+                <w:sz w:val="18"/>
+              </w:rPr>
+              <w:t>-22.4 to +0.0</w:t>
+            </w:r>
+          </w:p>
+        </w:tc>
+        <w:tc>
+          <w:tcPr>
+            <w:tcW w:type="dxa" w:w="1134"/>
+          </w:tcPr>
+          <w:p>
+            <w:pPr>
+              <w:jc w:val="right"/>
+            </w:pPr>
+            <w:r/>
+            <w:r>
+              <w:rPr>
+                <w:b w:val="0"/>
+                <w:sz w:val="18"/>
+              </w:rPr>
+              <w:t>1/21</w:t>
+            </w:r>
+          </w:p>
+        </w:tc>
+        <w:tc>
+          <w:tcPr>
+            <w:tcW w:type="dxa" w:w="907"/>
+          </w:tcPr>
+          <w:p>
+            <w:pPr>
+              <w:jc w:val="right"/>
+            </w:pPr>
+            <w:r/>
+            <w:r>
+              <w:rPr>
+                <w:b w:val="0"/>
+                <w:sz w:val="18"/>
+              </w:rPr>
+              <w:t>0.0001</w:t>
+            </w:r>
+          </w:p>
+        </w:tc>
+      </w:tr>
+      <w:tr>
+        <w:tc>
+          <w:tcPr>
+            <w:tcW w:type="dxa" w:w="1928"/>
+          </w:tcPr>
+          <w:p>
+            <w:r/>
+            <w:r>
+              <w:rPr>
+                <w:b w:val="0"/>
+                <w:sz w:val="18"/>
+              </w:rPr>
+              <w:t>Known (B): correct</w:t>
+            </w:r>
+          </w:p>
+        </w:tc>
+        <w:tc>
+          <w:tcPr>
+            <w:tcW w:type="dxa" w:w="2608"/>
+          </w:tcPr>
+          <w:p>
+            <w:r/>
+            <w:r>
+              <w:rPr>
+                <w:b w:val="0"/>
+                <w:sz w:val="18"/>
+              </w:rPr>
+              <w:t>Best close match vs k-NN (k=6)</w:t>
+            </w:r>
+          </w:p>
+        </w:tc>
+        <w:tc>
+          <w:tcPr>
+            <w:tcW w:type="dxa" w:w="1247"/>
+          </w:tcPr>
+          <w:p>
+            <w:pPr>
+              <w:jc w:val="right"/>
+            </w:pPr>
+            <w:r/>
+            <w:r>
+              <w:rPr>
+                <w:b w:val="0"/>
+                <w:sz w:val="18"/>
+              </w:rPr>
+              <w:t>-5.7</w:t>
+            </w:r>
+          </w:p>
+        </w:tc>
+        <w:tc>
+          <w:tcPr>
+            <w:tcW w:type="dxa" w:w="1587"/>
+          </w:tcPr>
+          <w:p>
+            <w:pPr>
+              <w:jc w:val="right"/>
+            </w:pPr>
+            <w:r/>
+            <w:r>
+              <w:rPr>
+                <w:b w:val="0"/>
+                <w:sz w:val="18"/>
+              </w:rPr>
+              <w:t>-17.6 to +6.3</w:t>
+            </w:r>
+          </w:p>
+        </w:tc>
+        <w:tc>
+          <w:tcPr>
+            <w:tcW w:type="dxa" w:w="1134"/>
+          </w:tcPr>
+          <w:p>
+            <w:pPr>
+              <w:jc w:val="right"/>
+            </w:pPr>
+            <w:r/>
+            <w:r>
+              <w:rPr>
+                <w:b w:val="0"/>
+                <w:sz w:val="18"/>
+              </w:rPr>
+              <w:t>10/21</w:t>
+            </w:r>
+          </w:p>
+        </w:tc>
+        <w:tc>
+          <w:tcPr>
+            <w:tcW w:type="dxa" w:w="907"/>
+          </w:tcPr>
+          <w:p>
+            <w:pPr>
+              <w:jc w:val="right"/>
+            </w:pPr>
+            <w:r/>
+            <w:r>
+              <w:rPr>
+                <w:b w:val="0"/>
+                <w:sz w:val="18"/>
+              </w:rPr>
+              <w:t>0.5752</w:t>
+            </w:r>
+          </w:p>
+        </w:tc>
+      </w:tr>
+      <w:tr>
+        <w:tc>
+          <w:tcPr>
+            <w:tcW w:type="dxa" w:w="1928"/>
+          </w:tcPr>
+          <w:p>
+            <w:r/>
+            <w:r>
+              <w:rPr>
+                <w:b w:val="0"/>
+                <w:sz w:val="18"/>
+              </w:rPr>
+              <w:t>Known (B): correct</w:t>
+            </w:r>
+          </w:p>
+        </w:tc>
+        <w:tc>
+          <w:tcPr>
+            <w:tcW w:type="dxa" w:w="2608"/>
+          </w:tcPr>
+          <w:p>
+            <w:r/>
+            <w:r>
+              <w:rPr>
+                <w:b w:val="0"/>
+                <w:sz w:val="18"/>
+              </w:rPr>
               <w:t>Best close match vs RF (k=6)</w:t>
             </w:r>
           </w:p>
@@ -11550,7 +12666,7 @@
                 <w:b w:val="0"/>
                 <w:sz w:val="18"/>
               </w:rPr>
-              <w:t>-13.8 to +1.9</w:t>
+              <w:t>-14.3 to +2.1</w:t>
             </w:r>
           </w:p>
         </w:tc>
@@ -11586,7 +12702,423 @@
                 <w:b w:val="0"/>
                 <w:sz w:val="18"/>
               </w:rPr>
-              <w:t>0.3835</w:t>
+              <w:t>0.5752</w:t>
+            </w:r>
+          </w:p>
+        </w:tc>
+      </w:tr>
+      <w:tr>
+        <w:tc>
+          <w:tcPr>
+            <w:tcW w:type="dxa" w:w="1928"/>
+          </w:tcPr>
+          <w:p>
+            <w:r/>
+            <w:r>
+              <w:rPr>
+                <w:b w:val="0"/>
+                <w:sz w:val="18"/>
+              </w:rPr>
+              <w:t>Known (B): correct</w:t>
+            </w:r>
+          </w:p>
+        </w:tc>
+        <w:tc>
+          <w:tcPr>
+            <w:tcW w:type="dxa" w:w="2608"/>
+          </w:tcPr>
+          <w:p>
+            <w:r/>
+            <w:r>
+              <w:rPr>
+                <w:b w:val="0"/>
+                <w:sz w:val="18"/>
+              </w:rPr>
+              <w:t>NJ tree + cut-off vs NJ tree</w:t>
+            </w:r>
+          </w:p>
+        </w:tc>
+        <w:tc>
+          <w:tcPr>
+            <w:tcW w:type="dxa" w:w="1247"/>
+          </w:tcPr>
+          <w:p>
+            <w:pPr>
+              <w:jc w:val="right"/>
+            </w:pPr>
+            <w:r/>
+            <w:r>
+              <w:rPr>
+                <w:b w:val="0"/>
+                <w:sz w:val="18"/>
+              </w:rPr>
+              <w:t>-7.2</w:t>
+            </w:r>
+          </w:p>
+        </w:tc>
+        <w:tc>
+          <w:tcPr>
+            <w:tcW w:type="dxa" w:w="1587"/>
+          </w:tcPr>
+          <w:p>
+            <w:pPr>
+              <w:jc w:val="right"/>
+            </w:pPr>
+            <w:r/>
+            <w:r>
+              <w:rPr>
+                <w:b w:val="0"/>
+                <w:sz w:val="18"/>
+              </w:rPr>
+              <w:t>-12.4 to -3.4</w:t>
+            </w:r>
+          </w:p>
+        </w:tc>
+        <w:tc>
+          <w:tcPr>
+            <w:tcW w:type="dxa" w:w="1134"/>
+          </w:tcPr>
+          <w:p>
+            <w:pPr>
+              <w:jc w:val="right"/>
+            </w:pPr>
+            <w:r/>
+            <w:r>
+              <w:rPr>
+                <w:b w:val="0"/>
+                <w:sz w:val="18"/>
+              </w:rPr>
+              <w:t>0/14</w:t>
+            </w:r>
+          </w:p>
+        </w:tc>
+        <w:tc>
+          <w:tcPr>
+            <w:tcW w:type="dxa" w:w="907"/>
+          </w:tcPr>
+          <w:p>
+            <w:pPr>
+              <w:jc w:val="right"/>
+            </w:pPr>
+            <w:r/>
+            <w:r>
+              <w:rPr>
+                <w:b w:val="0"/>
+                <w:sz w:val="18"/>
+              </w:rPr>
+              <w:t>0.0015</w:t>
+            </w:r>
+          </w:p>
+        </w:tc>
+      </w:tr>
+      <w:tr>
+        <w:tc>
+          <w:tcPr>
+            <w:tcW w:type="dxa" w:w="1928"/>
+          </w:tcPr>
+          <w:p>
+            <w:r/>
+            <w:r>
+              <w:rPr>
+                <w:b w:val="0"/>
+                <w:sz w:val="18"/>
+              </w:rPr>
+              <w:t>Known (B): correct</w:t>
+            </w:r>
+          </w:p>
+        </w:tc>
+        <w:tc>
+          <w:tcPr>
+            <w:tcW w:type="dxa" w:w="2608"/>
+          </w:tcPr>
+          <w:p>
+            <w:r/>
+            <w:r>
+              <w:rPr>
+                <w:b w:val="0"/>
+                <w:sz w:val="18"/>
+              </w:rPr>
+              <w:t>NJ tree + cut-off vs k-NN (k=6)</w:t>
+            </w:r>
+          </w:p>
+        </w:tc>
+        <w:tc>
+          <w:tcPr>
+            <w:tcW w:type="dxa" w:w="1247"/>
+          </w:tcPr>
+          <w:p>
+            <w:pPr>
+              <w:jc w:val="right"/>
+            </w:pPr>
+            <w:r/>
+            <w:r>
+              <w:rPr>
+                <w:b w:val="0"/>
+                <w:sz w:val="18"/>
+              </w:rPr>
+              <w:t>-2.6</w:t>
+            </w:r>
+          </w:p>
+        </w:tc>
+        <w:tc>
+          <w:tcPr>
+            <w:tcW w:type="dxa" w:w="1587"/>
+          </w:tcPr>
+          <w:p>
+            <w:pPr>
+              <w:jc w:val="right"/>
+            </w:pPr>
+            <w:r/>
+            <w:r>
+              <w:rPr>
+                <w:b w:val="0"/>
+                <w:sz w:val="18"/>
+              </w:rPr>
+              <w:t>-7.3 to +1.8</w:t>
+            </w:r>
+          </w:p>
+        </w:tc>
+        <w:tc>
+          <w:tcPr>
+            <w:tcW w:type="dxa" w:w="1134"/>
+          </w:tcPr>
+          <w:p>
+            <w:pPr>
+              <w:jc w:val="right"/>
+            </w:pPr>
+            <w:r/>
+            <w:r>
+              <w:rPr>
+                <w:b w:val="0"/>
+                <w:sz w:val="18"/>
+              </w:rPr>
+              <w:t>8/13</w:t>
+            </w:r>
+          </w:p>
+        </w:tc>
+        <w:tc>
+          <w:tcPr>
+            <w:tcW w:type="dxa" w:w="907"/>
+          </w:tcPr>
+          <w:p>
+            <w:pPr>
+              <w:jc w:val="right"/>
+            </w:pPr>
+            <w:r/>
+            <w:r>
+              <w:rPr>
+                <w:b w:val="0"/>
+                <w:sz w:val="18"/>
+              </w:rPr>
+              <w:t>1.0000</w:t>
+            </w:r>
+          </w:p>
+        </w:tc>
+      </w:tr>
+      <w:tr>
+        <w:tc>
+          <w:tcPr>
+            <w:tcW w:type="dxa" w:w="1928"/>
+          </w:tcPr>
+          <w:p>
+            <w:r/>
+            <w:r>
+              <w:rPr>
+                <w:b w:val="0"/>
+                <w:sz w:val="18"/>
+              </w:rPr>
+              <w:t>Known (B): correct</w:t>
+            </w:r>
+          </w:p>
+        </w:tc>
+        <w:tc>
+          <w:tcPr>
+            <w:tcW w:type="dxa" w:w="2608"/>
+          </w:tcPr>
+          <w:p>
+            <w:r/>
+            <w:r>
+              <w:rPr>
+                <w:b w:val="0"/>
+                <w:sz w:val="18"/>
+              </w:rPr>
+              <w:t>NJ tree + cut-off vs RF (k=6)</w:t>
+            </w:r>
+          </w:p>
+        </w:tc>
+        <w:tc>
+          <w:tcPr>
+            <w:tcW w:type="dxa" w:w="1247"/>
+          </w:tcPr>
+          <w:p>
+            <w:pPr>
+              <w:jc w:val="right"/>
+            </w:pPr>
+            <w:r/>
+            <w:r>
+              <w:rPr>
+                <w:b w:val="0"/>
+                <w:sz w:val="18"/>
+              </w:rPr>
+              <w:t>-2.1</w:t>
+            </w:r>
+          </w:p>
+        </w:tc>
+        <w:tc>
+          <w:tcPr>
+            <w:tcW w:type="dxa" w:w="1587"/>
+          </w:tcPr>
+          <w:p>
+            <w:pPr>
+              <w:jc w:val="right"/>
+            </w:pPr>
+            <w:r/>
+            <w:r>
+              <w:rPr>
+                <w:b w:val="0"/>
+                <w:sz w:val="18"/>
+              </w:rPr>
+              <w:t>-9.4 to +5.5</w:t>
+            </w:r>
+          </w:p>
+        </w:tc>
+        <w:tc>
+          <w:tcPr>
+            <w:tcW w:type="dxa" w:w="1134"/>
+          </w:tcPr>
+          <w:p>
+            <w:pPr>
+              <w:jc w:val="right"/>
+            </w:pPr>
+            <w:r/>
+            <w:r>
+              <w:rPr>
+                <w:b w:val="0"/>
+                <w:sz w:val="18"/>
+              </w:rPr>
+              <w:t>11/15</w:t>
+            </w:r>
+          </w:p>
+        </w:tc>
+        <w:tc>
+          <w:tcPr>
+            <w:tcW w:type="dxa" w:w="907"/>
+          </w:tcPr>
+          <w:p>
+            <w:pPr>
+              <w:jc w:val="right"/>
+            </w:pPr>
+            <w:r/>
+            <w:r>
+              <w:rPr>
+                <w:b w:val="0"/>
+                <w:sz w:val="18"/>
+              </w:rPr>
+              <w:t>1.0000</w:t>
+            </w:r>
+          </w:p>
+        </w:tc>
+      </w:tr>
+      <w:tr>
+        <w:tc>
+          <w:tcPr>
+            <w:tcW w:type="dxa" w:w="1928"/>
+          </w:tcPr>
+          <w:p>
+            <w:r/>
+            <w:r>
+              <w:rPr>
+                <w:b w:val="0"/>
+                <w:sz w:val="18"/>
+              </w:rPr>
+              <w:t>Known (B): correct</w:t>
+            </w:r>
+          </w:p>
+        </w:tc>
+        <w:tc>
+          <w:tcPr>
+            <w:tcW w:type="dxa" w:w="2608"/>
+          </w:tcPr>
+          <w:p>
+            <w:r/>
+            <w:r>
+              <w:rPr>
+                <w:b w:val="0"/>
+                <w:sz w:val="18"/>
+              </w:rPr>
+              <w:t>NJ tree + cut-off vs Best close match</w:t>
+            </w:r>
+          </w:p>
+        </w:tc>
+        <w:tc>
+          <w:tcPr>
+            <w:tcW w:type="dxa" w:w="1247"/>
+          </w:tcPr>
+          <w:p>
+            <w:pPr>
+              <w:jc w:val="right"/>
+            </w:pPr>
+            <w:r/>
+            <w:r>
+              <w:rPr>
+                <w:b w:val="0"/>
+                <w:sz w:val="18"/>
+              </w:rPr>
+              <w:t>+3.1</w:t>
+            </w:r>
+          </w:p>
+        </w:tc>
+        <w:tc>
+          <w:tcPr>
+            <w:tcW w:type="dxa" w:w="1587"/>
+          </w:tcPr>
+          <w:p>
+            <w:pPr>
+              <w:jc w:val="right"/>
+            </w:pPr>
+            <w:r/>
+            <w:r>
+              <w:rPr>
+                <w:b w:val="0"/>
+                <w:sz w:val="18"/>
+              </w:rPr>
+              <w:t>-9.9 to +17.5</w:t>
+            </w:r>
+          </w:p>
+        </w:tc>
+        <w:tc>
+          <w:tcPr>
+            <w:tcW w:type="dxa" w:w="1134"/>
+          </w:tcPr>
+          <w:p>
+            <w:pPr>
+              <w:jc w:val="right"/>
+            </w:pPr>
+            <w:r/>
+            <w:r>
+              <w:rPr>
+                <w:b w:val="0"/>
+                <w:sz w:val="18"/>
+              </w:rPr>
+              <w:t>20/14</w:t>
+            </w:r>
+          </w:p>
+        </w:tc>
+        <w:tc>
+          <w:tcPr>
+            <w:tcW w:type="dxa" w:w="907"/>
+          </w:tcPr>
+          <w:p>
+            <w:pPr>
+              <w:jc w:val="right"/>
+            </w:pPr>
+            <w:r/>
+            <w:r>
+              <w:rPr>
+                <w:b w:val="0"/>
+                <w:sz w:val="18"/>
+              </w:rPr>
+              <w:t>1.0000</w:t>
             </w:r>
           </w:p>
         </w:tc>
@@ -13281,6 +14813,318 @@
                 <w:sz w:val="18"/>
               </w:rPr>
               <w:t>18.6%</w:t>
+            </w:r>
+          </w:p>
+        </w:tc>
+      </w:tr>
+      <w:tr>
+        <w:tc>
+          <w:tcPr>
+            <w:tcW w:type="dxa" w:w="1928"/>
+          </w:tcPr>
+          <w:p>
+            <w:r/>
+            <w:r>
+              <w:rPr>
+                <w:b w:val="0"/>
+                <w:sz w:val="18"/>
+              </w:rPr>
+              <w:t>NJ tree + cut-off</w:t>
+            </w:r>
+          </w:p>
+        </w:tc>
+        <w:tc>
+          <w:tcPr>
+            <w:tcW w:type="dxa" w:w="1474"/>
+          </w:tcPr>
+          <w:p>
+            <w:r/>
+            <w:r>
+              <w:rPr>
+                <w:b w:val="0"/>
+                <w:sz w:val="18"/>
+              </w:rPr>
+              <w:t>accept 90%</w:t>
+            </w:r>
+          </w:p>
+        </w:tc>
+        <w:tc>
+          <w:tcPr>
+            <w:tcW w:type="dxa" w:w="1361"/>
+          </w:tcPr>
+          <w:p>
+            <w:pPr>
+              <w:jc w:val="right"/>
+            </w:pPr>
+            <w:r/>
+            <w:r>
+              <w:rPr>
+                <w:b w:val="0"/>
+                <w:sz w:val="18"/>
+              </w:rPr>
+              <w:t>100.0%</w:t>
+            </w:r>
+          </w:p>
+        </w:tc>
+        <w:tc>
+          <w:tcPr>
+            <w:tcW w:type="dxa" w:w="1587"/>
+          </w:tcPr>
+          <w:p>
+            <w:pPr>
+              <w:jc w:val="right"/>
+            </w:pPr>
+            <w:r/>
+            <w:r>
+              <w:rPr>
+                <w:b w:val="0"/>
+                <w:sz w:val="18"/>
+              </w:rPr>
+              <w:t>0.0%</w:t>
+            </w:r>
+          </w:p>
+        </w:tc>
+        <w:tc>
+          <w:tcPr>
+            <w:tcW w:type="dxa" w:w="1361"/>
+          </w:tcPr>
+          <w:p>
+            <w:pPr>
+              <w:jc w:val="right"/>
+            </w:pPr>
+            <w:r/>
+            <w:r>
+              <w:rPr>
+                <w:b w:val="0"/>
+                <w:sz w:val="18"/>
+              </w:rPr>
+              <w:t>79.8%</w:t>
+            </w:r>
+          </w:p>
+        </w:tc>
+        <w:tc>
+          <w:tcPr>
+            <w:tcW w:type="dxa" w:w="1361"/>
+          </w:tcPr>
+          <w:p>
+            <w:pPr>
+              <w:jc w:val="right"/>
+            </w:pPr>
+            <w:r/>
+            <w:r>
+              <w:rPr>
+                <w:b w:val="0"/>
+                <w:sz w:val="18"/>
+              </w:rPr>
+              <w:t>16.1%</w:t>
+            </w:r>
+          </w:p>
+        </w:tc>
+      </w:tr>
+      <w:tr>
+        <w:tc>
+          <w:tcPr>
+            <w:tcW w:type="dxa" w:w="1928"/>
+          </w:tcPr>
+          <w:p>
+            <w:r/>
+            <w:r>
+              <w:rPr>
+                <w:b w:val="0"/>
+                <w:sz w:val="18"/>
+              </w:rPr>
+              <w:t>NJ tree + cut-off</w:t>
+            </w:r>
+          </w:p>
+        </w:tc>
+        <w:tc>
+          <w:tcPr>
+            <w:tcW w:type="dxa" w:w="1474"/>
+          </w:tcPr>
+          <w:p>
+            <w:r/>
+            <w:r>
+              <w:rPr>
+                <w:b w:val="0"/>
+                <w:sz w:val="18"/>
+              </w:rPr>
+              <w:t>accept 95%</w:t>
+            </w:r>
+          </w:p>
+        </w:tc>
+        <w:tc>
+          <w:tcPr>
+            <w:tcW w:type="dxa" w:w="1361"/>
+          </w:tcPr>
+          <w:p>
+            <w:pPr>
+              <w:jc w:val="right"/>
+            </w:pPr>
+            <w:r/>
+            <w:r>
+              <w:rPr>
+                <w:b w:val="0"/>
+                <w:sz w:val="18"/>
+              </w:rPr>
+              <w:t>100.0%</w:t>
+            </w:r>
+          </w:p>
+        </w:tc>
+        <w:tc>
+          <w:tcPr>
+            <w:tcW w:type="dxa" w:w="1587"/>
+          </w:tcPr>
+          <w:p>
+            <w:pPr>
+              <w:jc w:val="right"/>
+            </w:pPr>
+            <w:r/>
+            <w:r>
+              <w:rPr>
+                <w:b w:val="0"/>
+                <w:sz w:val="18"/>
+              </w:rPr>
+              <w:t>0.0%</w:t>
+            </w:r>
+          </w:p>
+        </w:tc>
+        <w:tc>
+          <w:tcPr>
+            <w:tcW w:type="dxa" w:w="1361"/>
+          </w:tcPr>
+          <w:p>
+            <w:pPr>
+              <w:jc w:val="right"/>
+            </w:pPr>
+            <w:r/>
+            <w:r>
+              <w:rPr>
+                <w:b w:val="0"/>
+                <w:sz w:val="18"/>
+              </w:rPr>
+              <w:t>85.0%</w:t>
+            </w:r>
+          </w:p>
+        </w:tc>
+        <w:tc>
+          <w:tcPr>
+            <w:tcW w:type="dxa" w:w="1361"/>
+          </w:tcPr>
+          <w:p>
+            <w:pPr>
+              <w:jc w:val="right"/>
+            </w:pPr>
+            <w:r/>
+            <w:r>
+              <w:rPr>
+                <w:b w:val="0"/>
+                <w:sz w:val="18"/>
+              </w:rPr>
+              <w:t>10.9%</w:t>
+            </w:r>
+          </w:p>
+        </w:tc>
+      </w:tr>
+      <w:tr>
+        <w:tc>
+          <w:tcPr>
+            <w:tcW w:type="dxa" w:w="1928"/>
+          </w:tcPr>
+          <w:p>
+            <w:r/>
+            <w:r>
+              <w:rPr>
+                <w:b w:val="0"/>
+                <w:sz w:val="18"/>
+              </w:rPr>
+              <w:t>NJ tree + cut-off</w:t>
+            </w:r>
+          </w:p>
+        </w:tc>
+        <w:tc>
+          <w:tcPr>
+            <w:tcW w:type="dxa" w:w="1474"/>
+          </w:tcPr>
+          <w:p>
+            <w:r/>
+            <w:r>
+              <w:rPr>
+                <w:b w:val="0"/>
+                <w:sz w:val="18"/>
+              </w:rPr>
+              <w:t>accept 99%</w:t>
+            </w:r>
+          </w:p>
+        </w:tc>
+        <w:tc>
+          <w:tcPr>
+            <w:tcW w:type="dxa" w:w="1361"/>
+          </w:tcPr>
+          <w:p>
+            <w:pPr>
+              <w:jc w:val="right"/>
+            </w:pPr>
+            <w:r/>
+            <w:r>
+              <w:rPr>
+                <w:b w:val="0"/>
+                <w:sz w:val="18"/>
+              </w:rPr>
+              <w:t>97.8%</w:t>
+            </w:r>
+          </w:p>
+        </w:tc>
+        <w:tc>
+          <w:tcPr>
+            <w:tcW w:type="dxa" w:w="1587"/>
+          </w:tcPr>
+          <w:p>
+            <w:pPr>
+              <w:jc w:val="right"/>
+            </w:pPr>
+            <w:r/>
+            <w:r>
+              <w:rPr>
+                <w:b w:val="0"/>
+                <w:sz w:val="18"/>
+              </w:rPr>
+              <w:t>2.2%</w:t>
+            </w:r>
+          </w:p>
+        </w:tc>
+        <w:tc>
+          <w:tcPr>
+            <w:tcW w:type="dxa" w:w="1361"/>
+          </w:tcPr>
+          <w:p>
+            <w:pPr>
+              <w:jc w:val="right"/>
+            </w:pPr>
+            <w:r/>
+            <w:r>
+              <w:rPr>
+                <w:b w:val="0"/>
+                <w:sz w:val="18"/>
+              </w:rPr>
+              <w:t>89.6%</w:t>
+            </w:r>
+          </w:p>
+        </w:tc>
+        <w:tc>
+          <w:tcPr>
+            <w:tcW w:type="dxa" w:w="1361"/>
+          </w:tcPr>
+          <w:p>
+            <w:pPr>
+              <w:jc w:val="right"/>
+            </w:pPr>
+            <w:r/>
+            <w:r>
+              <w:rPr>
+                <w:b w:val="0"/>
+                <w:sz w:val="18"/>
+              </w:rPr>
+              <w:t>6.2%</w:t>
             </w:r>
           </w:p>
         </w:tc>

</xml_diff>